<commit_message>
Update PRT661 Group Project Plan-Group 5.docx
</commit_message>
<xml_diff>
--- a/documents/PRT661 Group Project Plan-Group 5.docx
+++ b/documents/PRT661 Group Project Plan-Group 5.docx
@@ -120,8 +120,8 @@
               <w:rFonts w:ascii="Times New Roman" w:hAnsi="Times New Roman"/>
               <w:b/>
               <w:bCs/>
-              <w:sz w:val="40"/>
-              <w:szCs w:val="40"/>
+              <w:sz w:val="38"/>
+              <w:szCs w:val="38"/>
               <w:lang w:val="vi-VN"/>
             </w:rPr>
           </w:pPr>
@@ -130,8 +130,8 @@
               <w:rFonts w:ascii="Times New Roman" w:hAnsi="Times New Roman"/>
               <w:b/>
               <w:bCs/>
-              <w:sz w:val="40"/>
-              <w:szCs w:val="40"/>
+              <w:sz w:val="38"/>
+              <w:szCs w:val="38"/>
             </w:rPr>
             <w:t>PRT661</w:t>
           </w:r>
@@ -144,8 +144,8 @@
               <w:rFonts w:ascii="Times New Roman" w:hAnsi="Times New Roman"/>
               <w:b/>
               <w:bCs/>
-              <w:sz w:val="40"/>
-              <w:szCs w:val="40"/>
+              <w:sz w:val="38"/>
+              <w:szCs w:val="38"/>
               <w:lang w:val="vi-VN"/>
             </w:rPr>
           </w:pPr>
@@ -154,8 +154,8 @@
               <w:rFonts w:ascii="Times New Roman" w:hAnsi="Times New Roman"/>
               <w:b/>
               <w:bCs/>
-              <w:sz w:val="40"/>
-              <w:szCs w:val="40"/>
+              <w:sz w:val="38"/>
+              <w:szCs w:val="38"/>
             </w:rPr>
             <w:t xml:space="preserve">DATA </w:t>
           </w:r>
@@ -164,8 +164,8 @@
               <w:rFonts w:ascii="Times New Roman" w:hAnsi="Times New Roman"/>
               <w:b/>
               <w:bCs/>
-              <w:sz w:val="40"/>
-              <w:szCs w:val="40"/>
+              <w:sz w:val="38"/>
+              <w:szCs w:val="38"/>
             </w:rPr>
             <w:t>SCIENCE</w:t>
           </w:r>
@@ -174,8 +174,8 @@
               <w:rFonts w:ascii="Times New Roman" w:hAnsi="Times New Roman"/>
               <w:b/>
               <w:bCs/>
-              <w:sz w:val="40"/>
-              <w:szCs w:val="40"/>
+              <w:sz w:val="38"/>
+              <w:szCs w:val="38"/>
               <w:lang w:val="vi-VN"/>
             </w:rPr>
             <w:t xml:space="preserve"> PRACTICE</w:t>
@@ -189,8 +189,8 @@
               <w:rFonts w:ascii="Times New Roman" w:hAnsi="Times New Roman"/>
               <w:b/>
               <w:bCs/>
-              <w:sz w:val="40"/>
-              <w:szCs w:val="40"/>
+              <w:sz w:val="38"/>
+              <w:szCs w:val="38"/>
             </w:rPr>
           </w:pPr>
         </w:p>
@@ -202,8 +202,8 @@
               <w:rFonts w:ascii="Times New Roman" w:hAnsi="Times New Roman"/>
               <w:b/>
               <w:bCs/>
-              <w:sz w:val="40"/>
-              <w:szCs w:val="40"/>
+              <w:sz w:val="38"/>
+              <w:szCs w:val="38"/>
             </w:rPr>
           </w:pPr>
           <w:r>
@@ -211,8 +211,8 @@
               <w:rFonts w:ascii="Times New Roman" w:hAnsi="Times New Roman"/>
               <w:b/>
               <w:bCs/>
-              <w:sz w:val="40"/>
-              <w:szCs w:val="40"/>
+              <w:sz w:val="38"/>
+              <w:szCs w:val="38"/>
             </w:rPr>
             <w:t>ASSESSMENT 01</w:t>
           </w:r>
@@ -225,8 +225,8 @@
               <w:rFonts w:ascii="Times New Roman" w:hAnsi="Times New Roman"/>
               <w:b/>
               <w:bCs/>
-              <w:sz w:val="40"/>
-              <w:szCs w:val="40"/>
+              <w:sz w:val="38"/>
+              <w:szCs w:val="38"/>
             </w:rPr>
           </w:pPr>
         </w:p>
@@ -238,8 +238,8 @@
               <w:rFonts w:ascii="Times New Roman" w:hAnsi="Times New Roman"/>
               <w:b/>
               <w:bCs/>
-              <w:sz w:val="40"/>
-              <w:szCs w:val="40"/>
+              <w:sz w:val="38"/>
+              <w:szCs w:val="38"/>
             </w:rPr>
           </w:pPr>
           <w:r>
@@ -247,20 +247,10 @@
               <w:rFonts w:ascii="Times New Roman" w:hAnsi="Times New Roman"/>
               <w:b/>
               <w:bCs/>
-              <w:sz w:val="40"/>
-              <w:szCs w:val="40"/>
+              <w:sz w:val="38"/>
+              <w:szCs w:val="38"/>
             </w:rPr>
             <w:t>GROUP PROJECT PLAN</w:t>
-          </w:r>
-          <w:r>
-            <w:rPr>
-              <w:rFonts w:ascii="Times New Roman" w:hAnsi="Times New Roman"/>
-              <w:b/>
-              <w:bCs/>
-              <w:sz w:val="40"/>
-              <w:szCs w:val="40"/>
-            </w:rPr>
-            <w:t>:</w:t>
           </w:r>
         </w:p>
         <w:p>
@@ -270,8 +260,8 @@
               <w:rFonts w:ascii="Times New Roman" w:hAnsi="Times New Roman"/>
               <w:b/>
               <w:bCs/>
-              <w:sz w:val="40"/>
-              <w:szCs w:val="40"/>
+              <w:sz w:val="38"/>
+              <w:szCs w:val="38"/>
             </w:rPr>
           </w:pPr>
           <w:r>
@@ -279,10 +269,50 @@
               <w:rFonts w:ascii="Times New Roman" w:hAnsi="Times New Roman"/>
               <w:b/>
               <w:bCs/>
-              <w:sz w:val="40"/>
-              <w:szCs w:val="40"/>
+              <w:sz w:val="38"/>
+              <w:szCs w:val="38"/>
             </w:rPr>
-            <w:t>FORECASTING ASSAULT RATES ACROSS NT REGIONS TO SUPPORT PUBLIC SAFETY RESOURCE PLANNING</w:t>
+            <w:t xml:space="preserve">FORECASTING ASSAULT RATES ACROSS </w:t>
+          </w:r>
+          <w:r>
+            <w:rPr>
+              <w:rFonts w:ascii="Times New Roman" w:hAnsi="Times New Roman"/>
+              <w:b/>
+              <w:bCs/>
+              <w:sz w:val="38"/>
+              <w:szCs w:val="38"/>
+            </w:rPr>
+            <w:t>NORTHERN</w:t>
+          </w:r>
+          <w:r>
+            <w:rPr>
+              <w:rFonts w:ascii="Times New Roman" w:hAnsi="Times New Roman"/>
+              <w:b/>
+              <w:bCs/>
+              <w:sz w:val="38"/>
+              <w:szCs w:val="38"/>
+            </w:rPr>
+            <w:t xml:space="preserve"> TERRITORY</w:t>
+          </w:r>
+          <w:r>
+            <w:rPr>
+              <w:rFonts w:ascii="Times New Roman" w:hAnsi="Times New Roman"/>
+              <w:b/>
+              <w:bCs/>
+              <w:sz w:val="38"/>
+              <w:szCs w:val="38"/>
+            </w:rPr>
+            <w:t xml:space="preserve"> </w:t>
+          </w:r>
+          <w:r>
+            <w:rPr>
+              <w:rFonts w:ascii="Times New Roman" w:hAnsi="Times New Roman"/>
+              <w:b/>
+              <w:bCs/>
+              <w:sz w:val="38"/>
+              <w:szCs w:val="38"/>
+            </w:rPr>
+            <w:t>REGIONS TO SUPPORT PUBLIC SAFETY RESOURCE PLANNING</w:t>
           </w:r>
         </w:p>
         <w:p>
@@ -356,7 +386,7 @@
               <w:sz w:val="28"/>
               <w:szCs w:val="28"/>
             </w:rPr>
-            <w:t xml:space="preserve">                                </w:t>
+            <w:t xml:space="preserve">                         </w:t>
           </w:r>
           <w:r>
             <w:rPr>
@@ -459,6 +489,14 @@
               <w:sz w:val="28"/>
               <w:szCs w:val="28"/>
             </w:rPr>
+            <w:t xml:space="preserve"> (Emma)</w:t>
+          </w:r>
+          <w:r>
+            <w:rPr>
+              <w:rFonts w:ascii="Times New Roman" w:eastAsiaTheme="minorEastAsia" w:hAnsi="Times New Roman"/>
+              <w:sz w:val="28"/>
+              <w:szCs w:val="28"/>
+            </w:rPr>
             <w:t xml:space="preserve"> - S389244</w:t>
           </w:r>
         </w:p>
@@ -482,7 +520,23 @@
               <w:sz w:val="28"/>
               <w:szCs w:val="28"/>
             </w:rPr>
-            <w:t>Ngoc Anh Nguyen - S386805</w:t>
+            <w:t xml:space="preserve">Ngoc Anh Nguyen </w:t>
+          </w:r>
+          <w:r>
+            <w:rPr>
+              <w:rFonts w:ascii="Times New Roman" w:eastAsiaTheme="minorEastAsia" w:hAnsi="Times New Roman"/>
+              <w:sz w:val="28"/>
+              <w:szCs w:val="28"/>
+            </w:rPr>
+            <w:t xml:space="preserve">(Will) </w:t>
+          </w:r>
+          <w:r>
+            <w:rPr>
+              <w:rFonts w:ascii="Times New Roman" w:eastAsiaTheme="minorEastAsia" w:hAnsi="Times New Roman"/>
+              <w:sz w:val="28"/>
+              <w:szCs w:val="28"/>
+            </w:rPr>
+            <w:t>- S386805</w:t>
           </w:r>
         </w:p>
         <w:p>
@@ -506,7 +560,24 @@
               <w:szCs w:val="28"/>
               <w:lang w:val="vi-VN"/>
             </w:rPr>
-            <w:t xml:space="preserve">Van Hoi Dang - </w:t>
+            <w:t xml:space="preserve">Van Hoi Dang </w:t>
+          </w:r>
+          <w:r>
+            <w:rPr>
+              <w:rFonts w:ascii="Times New Roman" w:eastAsiaTheme="minorEastAsia" w:hAnsi="Times New Roman"/>
+              <w:sz w:val="28"/>
+              <w:szCs w:val="28"/>
+            </w:rPr>
+            <w:t xml:space="preserve">(Hendrick) </w:t>
+          </w:r>
+          <w:r>
+            <w:rPr>
+              <w:rFonts w:ascii="Times New Roman" w:eastAsiaTheme="minorEastAsia" w:hAnsi="Times New Roman"/>
+              <w:sz w:val="28"/>
+              <w:szCs w:val="28"/>
+              <w:lang w:val="vi-VN"/>
+            </w:rPr>
+            <w:t xml:space="preserve">- </w:t>
           </w:r>
           <w:r>
             <w:rPr>
@@ -535,7 +606,25 @@
               <w:sz w:val="28"/>
               <w:szCs w:val="28"/>
             </w:rPr>
-            <w:t>Le Nhat Minh Tran - S390789</w:t>
+            <w:t xml:space="preserve">Le Nhat Minh Tran </w:t>
+          </w:r>
+          <w:r>
+            <w:rPr>
+              <w:rFonts w:ascii="Times New Roman" w:eastAsia="Calibri" w:hAnsi="Times New Roman"/>
+              <w:color w:val="000000" w:themeColor="text1"/>
+              <w:sz w:val="28"/>
+              <w:szCs w:val="28"/>
+            </w:rPr>
+            <w:t xml:space="preserve">(Thomas) </w:t>
+          </w:r>
+          <w:r>
+            <w:rPr>
+              <w:rFonts w:ascii="Times New Roman" w:eastAsia="Calibri" w:hAnsi="Times New Roman"/>
+              <w:color w:val="000000" w:themeColor="text1"/>
+              <w:sz w:val="28"/>
+              <w:szCs w:val="28"/>
+            </w:rPr>
+            <w:t>- S390789</w:t>
           </w:r>
         </w:p>
         <w:p>
@@ -572,6 +661,28 @@
               <w:b/>
               <w:bCs/>
               <w:lang w:val="vi-VN"/>
+            </w:rPr>
+          </w:pPr>
+        </w:p>
+        <w:p>
+          <w:pPr>
+            <w:spacing w:line="360" w:lineRule="auto"/>
+            <w:jc w:val="both"/>
+            <w:rPr>
+              <w:rFonts w:ascii="Times New Roman" w:eastAsia="Aptos" w:hAnsi="Times New Roman"/>
+              <w:b/>
+              <w:bCs/>
+            </w:rPr>
+          </w:pPr>
+        </w:p>
+        <w:p>
+          <w:pPr>
+            <w:spacing w:line="360" w:lineRule="auto"/>
+            <w:jc w:val="both"/>
+            <w:rPr>
+              <w:rFonts w:ascii="Times New Roman" w:eastAsia="Aptos" w:hAnsi="Times New Roman"/>
+              <w:b/>
+              <w:bCs/>
             </w:rPr>
           </w:pPr>
         </w:p>
@@ -667,6 +778,7 @@
               <w:sz w:val="2"/>
               <w:szCs w:val="2"/>
             </w:rPr>
+            <w:lastRenderedPageBreak/>
             <w:t>￼</w:t>
           </w:r>
           <w:r>
@@ -772,6 +884,7 @@
           <w:sz w:val="24"/>
           <w:szCs w:val="24"/>
         </w:rPr>
+        <w:lastRenderedPageBreak/>
         <w:t>Project</w:t>
       </w:r>
       <w:r>
@@ -794,7 +907,6 @@
           <w:lang w:eastAsia="en-AU"/>
         </w:rPr>
       </w:pPr>
-      <w:proofErr w:type="gramStart"/>
       <w:r>
         <w:rPr>
           <w:rFonts w:ascii="Times New Roman" w:eastAsia="Times New Roman" w:hAnsi="Symbol"/>
@@ -809,16 +921,7 @@
           <w:sz w:val="24"/>
           <w:lang w:eastAsia="en-AU"/>
         </w:rPr>
-        <w:t xml:space="preserve">  project</w:t>
-      </w:r>
-      <w:proofErr w:type="gramEnd"/>
-      <w:r>
-        <w:rPr>
-          <w:rFonts w:ascii="Times New Roman" w:eastAsia="Times New Roman" w:hAnsi="Times New Roman"/>
-          <w:sz w:val="24"/>
-          <w:lang w:eastAsia="en-AU"/>
-        </w:rPr>
-        <w:t xml:space="preserve"> description: forecasting system for monthly, region-level assault rates in the NT </w:t>
+        <w:t xml:space="preserve">  project description: forecasting system for monthly, region-level assault rates in the NT </w:t>
       </w:r>
     </w:p>
     <w:p>
@@ -831,7 +934,6 @@
           <w:lang w:eastAsia="en-AU"/>
         </w:rPr>
       </w:pPr>
-      <w:proofErr w:type="gramStart"/>
       <w:r>
         <w:rPr>
           <w:rFonts w:ascii="Times New Roman" w:eastAsia="Times New Roman" w:hAnsi="Symbol"/>
@@ -846,16 +948,7 @@
           <w:sz w:val="24"/>
           <w:lang w:eastAsia="en-AU"/>
         </w:rPr>
-        <w:t xml:space="preserve">  3</w:t>
-      </w:r>
-      <w:proofErr w:type="gramEnd"/>
-      <w:r>
-        <w:rPr>
-          <w:rFonts w:ascii="Times New Roman" w:eastAsia="Times New Roman" w:hAnsi="Times New Roman"/>
-          <w:sz w:val="24"/>
-          <w:lang w:eastAsia="en-AU"/>
-        </w:rPr>
-        <w:t xml:space="preserve"> objectives: (1) build the data pipeline (</w:t>
+        <w:t xml:space="preserve">  3 objectives: (1) build the data pipeline (</w:t>
       </w:r>
       <w:proofErr w:type="spellStart"/>
       <w:r>
@@ -891,7 +984,6 @@
           <w:szCs w:val="24"/>
         </w:rPr>
       </w:pPr>
-      <w:proofErr w:type="gramStart"/>
       <w:r>
         <w:rPr>
           <w:rFonts w:ascii="Times New Roman" w:eastAsia="Times New Roman" w:hAnsi="Symbol" w:cs="Times New Roman"/>
@@ -908,17 +1000,7 @@
           <w:szCs w:val="24"/>
           <w:lang w:val="en-AU" w:eastAsia="en-AU"/>
         </w:rPr>
-        <w:t xml:space="preserve">  Who</w:t>
-      </w:r>
-      <w:proofErr w:type="gramEnd"/>
-      <w:r>
-        <w:rPr>
-          <w:rFonts w:ascii="Times New Roman" w:eastAsia="Times New Roman" w:hAnsi="Times New Roman" w:cs="Times New Roman"/>
-          <w:sz w:val="24"/>
-          <w:szCs w:val="24"/>
-          <w:lang w:val="en-AU" w:eastAsia="en-AU"/>
-        </w:rPr>
-        <w:t xml:space="preserve"> benefits / end user (PFES operations)</w:t>
+        <w:t xml:space="preserve">  Who benefits / end user (PFES operations)</w:t>
       </w:r>
     </w:p>
     <w:p>
@@ -1063,7 +1145,6 @@
           <w:lang w:eastAsia="en-AU"/>
         </w:rPr>
       </w:pPr>
-      <w:proofErr w:type="gramStart"/>
       <w:r>
         <w:rPr>
           <w:rFonts w:ascii="Times New Roman" w:eastAsia="Times New Roman" w:hAnsi="Symbol"/>
@@ -1078,34 +1159,7 @@
           <w:sz w:val="24"/>
           <w:lang w:eastAsia="en-AU"/>
         </w:rPr>
-        <w:t xml:space="preserve">  The</w:t>
-      </w:r>
-      <w:proofErr w:type="gramEnd"/>
-      <w:r>
-        <w:rPr>
-          <w:rFonts w:ascii="Times New Roman" w:eastAsia="Times New Roman" w:hAnsi="Times New Roman"/>
-          <w:sz w:val="24"/>
-          <w:lang w:eastAsia="en-AU"/>
-        </w:rPr>
-        <w:t xml:space="preserve"> gap: PFES </w:t>
-      </w:r>
-      <w:proofErr w:type="gramStart"/>
-      <w:r>
-        <w:rPr>
-          <w:rFonts w:ascii="Times New Roman" w:eastAsia="Times New Roman" w:hAnsi="Times New Roman"/>
-          <w:sz w:val="24"/>
-          <w:lang w:eastAsia="en-AU"/>
-        </w:rPr>
-        <w:t>has</w:t>
-      </w:r>
-      <w:proofErr w:type="gramEnd"/>
-      <w:r>
-        <w:rPr>
-          <w:rFonts w:ascii="Times New Roman" w:eastAsia="Times New Roman" w:hAnsi="Times New Roman"/>
-          <w:sz w:val="24"/>
-          <w:lang w:eastAsia="en-AU"/>
-        </w:rPr>
-        <w:t xml:space="preserve"> descriptive reporting only, no forward-looking capability </w:t>
+        <w:t xml:space="preserve">  The gap: PFES has descriptive reporting only, no forward-looking capability </w:t>
       </w:r>
     </w:p>
     <w:p>
@@ -1118,7 +1172,6 @@
           <w:lang w:eastAsia="en-AU"/>
         </w:rPr>
       </w:pPr>
-      <w:proofErr w:type="gramStart"/>
       <w:r>
         <w:rPr>
           <w:rFonts w:ascii="Times New Roman" w:eastAsia="Times New Roman" w:hAnsi="Symbol"/>
@@ -1133,16 +1186,7 @@
           <w:sz w:val="24"/>
           <w:lang w:eastAsia="en-AU"/>
         </w:rPr>
-        <w:t xml:space="preserve">  Why</w:t>
-      </w:r>
-      <w:proofErr w:type="gramEnd"/>
-      <w:r>
-        <w:rPr>
-          <w:rFonts w:ascii="Times New Roman" w:eastAsia="Times New Roman" w:hAnsi="Times New Roman"/>
-          <w:sz w:val="24"/>
-          <w:lang w:eastAsia="en-AU"/>
-        </w:rPr>
-        <w:t xml:space="preserve"> it matters: NT's assault rate, resource allocation currently reactive </w:t>
+        <w:t xml:space="preserve">  Why it matters: NT's assault rate, resource allocation currently reactive </w:t>
       </w:r>
     </w:p>
     <w:p>
@@ -1160,7 +1204,6 @@
           <w:szCs w:val="24"/>
         </w:rPr>
       </w:pPr>
-      <w:proofErr w:type="gramStart"/>
       <w:r>
         <w:rPr>
           <w:rFonts w:ascii="Times New Roman" w:eastAsia="Times New Roman" w:hAnsi="Symbol" w:cs="Times New Roman"/>
@@ -1177,17 +1220,7 @@
           <w:szCs w:val="24"/>
           <w:lang w:val="en-AU" w:eastAsia="en-AU"/>
         </w:rPr>
-        <w:t xml:space="preserve">  What</w:t>
-      </w:r>
-      <w:proofErr w:type="gramEnd"/>
-      <w:r>
-        <w:rPr>
-          <w:rFonts w:ascii="Times New Roman" w:eastAsia="Times New Roman" w:hAnsi="Times New Roman" w:cs="Times New Roman"/>
-          <w:sz w:val="24"/>
-          <w:szCs w:val="24"/>
-          <w:lang w:val="en-AU" w:eastAsia="en-AU"/>
-        </w:rPr>
-        <w:t xml:space="preserve"> this project delivers to close that gap</w:t>
+        <w:t xml:space="preserve">  What this project delivers to close that gap</w:t>
       </w:r>
     </w:p>
     <w:p>
@@ -1231,6 +1264,8 @@
         <w:jc w:val="both"/>
         <w:rPr>
           <w:rFonts w:ascii="Times New Roman" w:eastAsiaTheme="minorEastAsia" w:hAnsi="Times New Roman" w:cs="Times New Roman"/>
+          <w:i/>
+          <w:iCs/>
           <w:sz w:val="24"/>
           <w:szCs w:val="24"/>
           <w:lang w:val="vi-VN"/>
@@ -1239,11 +1274,38 @@
       <w:r>
         <w:rPr>
           <w:rFonts w:ascii="Times New Roman" w:eastAsiaTheme="minorEastAsia" w:hAnsi="Times New Roman" w:cs="Times New Roman"/>
+          <w:i/>
+          <w:iCs/>
           <w:sz w:val="24"/>
           <w:szCs w:val="24"/>
           <w:lang w:val="vi-VN"/>
         </w:rPr>
         <w:t>List datasets</w:t>
+      </w:r>
+    </w:p>
+    <w:p>
+      <w:pPr>
+        <w:pStyle w:val="ListParagraph"/>
+        <w:spacing w:before="120" w:after="120"/>
+        <w:ind w:left="426"/>
+        <w:jc w:val="both"/>
+        <w:rPr>
+          <w:rFonts w:ascii="Times New Roman" w:eastAsiaTheme="minorEastAsia" w:hAnsi="Times New Roman"/>
+          <w:i/>
+          <w:iCs/>
+          <w:sz w:val="24"/>
+          <w:lang w:val="en-AU"/>
+        </w:rPr>
+      </w:pPr>
+      <w:r>
+        <w:rPr>
+          <w:rFonts w:ascii="Times New Roman" w:eastAsiaTheme="minorEastAsia" w:hAnsi="Times New Roman"/>
+          <w:i/>
+          <w:iCs/>
+          <w:sz w:val="24"/>
+          <w:lang w:val="en-AU"/>
+        </w:rPr>
+        <w:t xml:space="preserve">Diagram 1 (architecture) + explanation of each stage, explicitly stating which are AWS vs Python </w:t>
       </w:r>
     </w:p>
     <w:p>
@@ -1258,14 +1320,6 @@
           <w:lang w:val="en-AU"/>
         </w:rPr>
       </w:pPr>
-      <w:r>
-        <w:rPr>
-          <w:rFonts w:ascii="Times New Roman" w:eastAsiaTheme="minorEastAsia" w:hAnsi="Times New Roman"/>
-          <w:sz w:val="24"/>
-          <w:lang w:val="en-AU"/>
-        </w:rPr>
-        <w:t xml:space="preserve">Diagram 1 (architecture) + explanation of each stage, explicitly stating which are AWS vs Python </w:t>
-      </w:r>
     </w:p>
     <w:p>
       <w:pPr>
@@ -1310,6 +1364,7 @@
           <w:rFonts w:ascii="Times New Roman" w:eastAsiaTheme="minorEastAsia" w:hAnsi="Times New Roman" w:cs="Times New Roman"/>
           <w:sz w:val="24"/>
           <w:szCs w:val="24"/>
+          <w:lang w:val="en-AU"/>
         </w:rPr>
       </w:pPr>
       <w:r>
@@ -1317,10 +1372,1998 @@
           <w:rFonts w:ascii="Times New Roman" w:eastAsiaTheme="minorEastAsia" w:hAnsi="Times New Roman" w:cs="Times New Roman"/>
           <w:sz w:val="24"/>
           <w:szCs w:val="24"/>
+          <w:lang w:val="en-AU"/>
+        </w:rPr>
+        <w:t>The workflow plan spans the full 12-week semester and is aligned to the four assessment milestones</w:t>
+      </w:r>
+      <w:r>
+        <w:rPr>
+          <w:rFonts w:ascii="Times New Roman" w:eastAsiaTheme="minorEastAsia" w:hAnsi="Times New Roman" w:cs="Times New Roman"/>
+          <w:sz w:val="24"/>
+          <w:szCs w:val="24"/>
+          <w:lang w:val="en-AU"/>
+        </w:rPr>
+        <w:t xml:space="preserve"> (Table 1). Weeks immediately preceding each submission are used for consolidation and reporting</w:t>
+      </w:r>
+      <w:r>
+        <w:rPr>
+          <w:rFonts w:ascii="Times New Roman" w:eastAsiaTheme="minorEastAsia" w:hAnsi="Times New Roman" w:cs="Times New Roman"/>
+          <w:sz w:val="24"/>
+          <w:szCs w:val="24"/>
+          <w:lang w:val="en-AU"/>
+        </w:rPr>
+        <w:t xml:space="preserve">, other weeks are allocated to the team members responsible for the relevant </w:t>
+      </w:r>
+      <w:r>
+        <w:rPr>
+          <w:rFonts w:ascii="Times New Roman" w:eastAsiaTheme="minorEastAsia" w:hAnsi="Times New Roman" w:cs="Times New Roman"/>
+          <w:sz w:val="24"/>
+          <w:szCs w:val="24"/>
+          <w:lang w:val="en-AU"/>
+        </w:rPr>
+        <w:t>architecture stage.</w:t>
+      </w:r>
+    </w:p>
+    <w:p>
+      <w:pPr>
+        <w:pStyle w:val="Caption"/>
+        <w:jc w:val="center"/>
+        <w:rPr>
+          <w:rFonts w:ascii="Times New Roman" w:eastAsiaTheme="minorEastAsia" w:hAnsi="Times New Roman"/>
+          <w:color w:val="auto"/>
+          <w:sz w:val="24"/>
+          <w:szCs w:val="24"/>
           <w:lang w:val="vi-VN"/>
         </w:rPr>
-        <w:t>Diagram 2 (timeline/roadmap) + detail table</w:t>
+      </w:pPr>
+      <w:r>
+        <w:rPr>
+          <w:rFonts w:ascii="Times New Roman" w:hAnsi="Times New Roman"/>
+          <w:color w:val="auto"/>
+          <w:sz w:val="24"/>
+          <w:szCs w:val="24"/>
+        </w:rPr>
+        <w:t xml:space="preserve">Table </w:t>
       </w:r>
+      <w:r>
+        <w:rPr>
+          <w:rFonts w:ascii="Times New Roman" w:hAnsi="Times New Roman"/>
+          <w:color w:val="auto"/>
+          <w:sz w:val="24"/>
+          <w:szCs w:val="24"/>
+        </w:rPr>
+        <w:fldChar w:fldCharType="begin"/>
+      </w:r>
+      <w:r>
+        <w:rPr>
+          <w:rFonts w:ascii="Times New Roman" w:hAnsi="Times New Roman"/>
+          <w:color w:val="auto"/>
+          <w:sz w:val="24"/>
+          <w:szCs w:val="24"/>
+        </w:rPr>
+        <w:instrText xml:space="preserve"> SEQ Table \* ROMAN </w:instrText>
+      </w:r>
+      <w:r>
+        <w:rPr>
+          <w:rFonts w:ascii="Times New Roman" w:hAnsi="Times New Roman"/>
+          <w:color w:val="auto"/>
+          <w:sz w:val="24"/>
+          <w:szCs w:val="24"/>
+        </w:rPr>
+        <w:fldChar w:fldCharType="separate"/>
+      </w:r>
+      <w:r>
+        <w:rPr>
+          <w:rFonts w:ascii="Times New Roman" w:hAnsi="Times New Roman"/>
+          <w:noProof/>
+          <w:color w:val="auto"/>
+          <w:sz w:val="24"/>
+          <w:szCs w:val="24"/>
+        </w:rPr>
+        <w:t>I</w:t>
+      </w:r>
+      <w:r>
+        <w:rPr>
+          <w:rFonts w:ascii="Times New Roman" w:hAnsi="Times New Roman"/>
+          <w:color w:val="auto"/>
+          <w:sz w:val="24"/>
+          <w:szCs w:val="24"/>
+        </w:rPr>
+        <w:fldChar w:fldCharType="end"/>
+      </w:r>
+      <w:r>
+        <w:rPr>
+          <w:rFonts w:ascii="Times New Roman" w:hAnsi="Times New Roman"/>
+          <w:color w:val="auto"/>
+          <w:sz w:val="24"/>
+          <w:szCs w:val="24"/>
+          <w:lang w:val="vi-VN"/>
+        </w:rPr>
+        <w:t>. Twelve-week workflow plan</w:t>
+      </w:r>
+    </w:p>
+    <w:tbl>
+      <w:tblPr>
+        <w:tblStyle w:val="TableGrid"/>
+        <w:tblW w:w="0" w:type="auto"/>
+        <w:tblInd w:w="426" w:type="dxa"/>
+        <w:tblLook w:val="04A0" w:firstRow="1" w:lastRow="0" w:firstColumn="1" w:lastColumn="0" w:noHBand="0" w:noVBand="1"/>
+      </w:tblPr>
+      <w:tblGrid>
+        <w:gridCol w:w="804"/>
+        <w:gridCol w:w="3026"/>
+        <w:gridCol w:w="3117"/>
+        <w:gridCol w:w="1643"/>
+      </w:tblGrid>
+      <w:tr>
+        <w:tc>
+          <w:tcPr>
+            <w:tcW w:w="804" w:type="dxa"/>
+            <w:shd w:val="clear" w:color="auto" w:fill="DBE5F1" w:themeFill="accent1" w:themeFillTint="33"/>
+          </w:tcPr>
+          <w:p>
+            <w:pPr>
+              <w:pStyle w:val="ListParagraph"/>
+              <w:spacing w:before="120" w:after="120" w:line="240" w:lineRule="auto"/>
+              <w:ind w:left="0"/>
+              <w:contextualSpacing w:val="0"/>
+              <w:jc w:val="center"/>
+              <w:rPr>
+                <w:rFonts w:ascii="Times New Roman" w:eastAsiaTheme="minorEastAsia" w:hAnsi="Times New Roman" w:cs="Times New Roman"/>
+                <w:b/>
+                <w:bCs/>
+                <w:sz w:val="24"/>
+                <w:szCs w:val="24"/>
+                <w:lang w:val="en-AU"/>
+              </w:rPr>
+            </w:pPr>
+            <w:r>
+              <w:rPr>
+                <w:rFonts w:ascii="Times New Roman" w:eastAsiaTheme="minorEastAsia" w:hAnsi="Times New Roman" w:cs="Times New Roman"/>
+                <w:b/>
+                <w:bCs/>
+                <w:sz w:val="24"/>
+                <w:szCs w:val="24"/>
+                <w:lang w:val="en-AU"/>
+              </w:rPr>
+              <w:t>Week</w:t>
+            </w:r>
+          </w:p>
+        </w:tc>
+        <w:tc>
+          <w:tcPr>
+            <w:tcW w:w="3026" w:type="dxa"/>
+            <w:shd w:val="clear" w:color="auto" w:fill="DBE5F1" w:themeFill="accent1" w:themeFillTint="33"/>
+          </w:tcPr>
+          <w:p>
+            <w:pPr>
+              <w:pStyle w:val="ListParagraph"/>
+              <w:spacing w:before="120" w:after="120" w:line="240" w:lineRule="auto"/>
+              <w:ind w:left="0"/>
+              <w:contextualSpacing w:val="0"/>
+              <w:jc w:val="center"/>
+              <w:rPr>
+                <w:rFonts w:ascii="Times New Roman" w:eastAsiaTheme="minorEastAsia" w:hAnsi="Times New Roman" w:cs="Times New Roman"/>
+                <w:b/>
+                <w:bCs/>
+                <w:sz w:val="24"/>
+                <w:szCs w:val="24"/>
+                <w:lang w:val="en-AU"/>
+              </w:rPr>
+            </w:pPr>
+            <w:r>
+              <w:rPr>
+                <w:rFonts w:ascii="Times New Roman" w:eastAsiaTheme="minorEastAsia" w:hAnsi="Times New Roman" w:cs="Times New Roman"/>
+                <w:b/>
+                <w:bCs/>
+                <w:sz w:val="24"/>
+                <w:szCs w:val="24"/>
+                <w:lang w:val="en-AU"/>
+              </w:rPr>
+              <w:t>Focus</w:t>
+            </w:r>
+          </w:p>
+        </w:tc>
+        <w:tc>
+          <w:tcPr>
+            <w:tcW w:w="3117" w:type="dxa"/>
+            <w:shd w:val="clear" w:color="auto" w:fill="DBE5F1" w:themeFill="accent1" w:themeFillTint="33"/>
+          </w:tcPr>
+          <w:p>
+            <w:pPr>
+              <w:pStyle w:val="ListParagraph"/>
+              <w:spacing w:before="120" w:after="120" w:line="240" w:lineRule="auto"/>
+              <w:ind w:left="0"/>
+              <w:contextualSpacing w:val="0"/>
+              <w:jc w:val="center"/>
+              <w:rPr>
+                <w:rFonts w:ascii="Times New Roman" w:eastAsiaTheme="minorEastAsia" w:hAnsi="Times New Roman" w:cs="Times New Roman"/>
+                <w:b/>
+                <w:bCs/>
+                <w:sz w:val="24"/>
+                <w:szCs w:val="24"/>
+                <w:lang w:val="en-AU"/>
+              </w:rPr>
+            </w:pPr>
+            <w:r>
+              <w:rPr>
+                <w:rFonts w:ascii="Times New Roman" w:eastAsiaTheme="minorEastAsia" w:hAnsi="Times New Roman" w:cs="Times New Roman"/>
+                <w:b/>
+                <w:bCs/>
+                <w:sz w:val="24"/>
+                <w:szCs w:val="24"/>
+                <w:lang w:val="en-AU"/>
+              </w:rPr>
+              <w:t>Deliverable</w:t>
+            </w:r>
+          </w:p>
+        </w:tc>
+        <w:tc>
+          <w:tcPr>
+            <w:tcW w:w="1643" w:type="dxa"/>
+            <w:shd w:val="clear" w:color="auto" w:fill="DBE5F1" w:themeFill="accent1" w:themeFillTint="33"/>
+          </w:tcPr>
+          <w:p>
+            <w:pPr>
+              <w:pStyle w:val="ListParagraph"/>
+              <w:spacing w:before="120" w:after="120" w:line="240" w:lineRule="auto"/>
+              <w:ind w:left="0"/>
+              <w:contextualSpacing w:val="0"/>
+              <w:jc w:val="center"/>
+              <w:rPr>
+                <w:rFonts w:ascii="Times New Roman" w:eastAsiaTheme="minorEastAsia" w:hAnsi="Times New Roman" w:cs="Times New Roman"/>
+                <w:b/>
+                <w:bCs/>
+                <w:sz w:val="24"/>
+                <w:szCs w:val="24"/>
+                <w:lang w:val="en-AU"/>
+              </w:rPr>
+            </w:pPr>
+            <w:r>
+              <w:rPr>
+                <w:rFonts w:ascii="Times New Roman" w:eastAsiaTheme="minorEastAsia" w:hAnsi="Times New Roman" w:cs="Times New Roman"/>
+                <w:b/>
+                <w:bCs/>
+                <w:sz w:val="24"/>
+                <w:szCs w:val="24"/>
+                <w:lang w:val="en-AU"/>
+              </w:rPr>
+              <w:t>Owner</w:t>
+            </w:r>
+          </w:p>
+        </w:tc>
+      </w:tr>
+      <w:tr>
+        <w:tc>
+          <w:tcPr>
+            <w:tcW w:w="804" w:type="dxa"/>
+          </w:tcPr>
+          <w:p>
+            <w:pPr>
+              <w:pStyle w:val="ListParagraph"/>
+              <w:spacing w:before="120" w:after="120" w:line="240" w:lineRule="auto"/>
+              <w:ind w:left="0"/>
+              <w:contextualSpacing w:val="0"/>
+              <w:jc w:val="both"/>
+              <w:rPr>
+                <w:rFonts w:ascii="Times New Roman" w:eastAsiaTheme="minorEastAsia" w:hAnsi="Times New Roman" w:cs="Times New Roman"/>
+                <w:sz w:val="24"/>
+                <w:szCs w:val="24"/>
+                <w:lang w:val="en-AU"/>
+              </w:rPr>
+            </w:pPr>
+            <w:r>
+              <w:rPr>
+                <w:rFonts w:ascii="Times New Roman" w:eastAsiaTheme="minorEastAsia" w:hAnsi="Times New Roman" w:cs="Times New Roman"/>
+                <w:sz w:val="24"/>
+                <w:szCs w:val="24"/>
+                <w:lang w:val="en-AU"/>
+              </w:rPr>
+              <w:t>1</w:t>
+            </w:r>
+          </w:p>
+        </w:tc>
+        <w:tc>
+          <w:tcPr>
+            <w:tcW w:w="3026" w:type="dxa"/>
+          </w:tcPr>
+          <w:p>
+            <w:pPr>
+              <w:pStyle w:val="ListParagraph"/>
+              <w:spacing w:before="120" w:after="120" w:line="240" w:lineRule="auto"/>
+              <w:ind w:left="0"/>
+              <w:contextualSpacing w:val="0"/>
+              <w:jc w:val="both"/>
+              <w:rPr>
+                <w:rFonts w:ascii="Times New Roman" w:eastAsiaTheme="minorEastAsia" w:hAnsi="Times New Roman" w:cs="Times New Roman"/>
+                <w:sz w:val="24"/>
+                <w:szCs w:val="24"/>
+                <w:lang w:val="en-AU"/>
+              </w:rPr>
+            </w:pPr>
+            <w:r>
+              <w:rPr>
+                <w:rFonts w:ascii="Times New Roman" w:eastAsiaTheme="minorEastAsia" w:hAnsi="Times New Roman" w:cs="Times New Roman"/>
+                <w:sz w:val="24"/>
+                <w:szCs w:val="24"/>
+                <w:lang w:val="en-AU"/>
+              </w:rPr>
+              <w:t>Team formation, theme confirmation, environment setup.</w:t>
+            </w:r>
+          </w:p>
+        </w:tc>
+        <w:tc>
+          <w:tcPr>
+            <w:tcW w:w="3117" w:type="dxa"/>
+          </w:tcPr>
+          <w:p>
+            <w:pPr>
+              <w:pStyle w:val="ListParagraph"/>
+              <w:spacing w:before="120" w:after="120" w:line="240" w:lineRule="auto"/>
+              <w:ind w:left="0"/>
+              <w:contextualSpacing w:val="0"/>
+              <w:jc w:val="both"/>
+              <w:rPr>
+                <w:rFonts w:ascii="Times New Roman" w:eastAsiaTheme="minorEastAsia" w:hAnsi="Times New Roman" w:cs="Times New Roman"/>
+                <w:sz w:val="24"/>
+                <w:szCs w:val="24"/>
+                <w:lang w:val="en-AU"/>
+              </w:rPr>
+            </w:pPr>
+            <w:r>
+              <w:rPr>
+                <w:rFonts w:ascii="Times New Roman" w:eastAsiaTheme="minorEastAsia" w:hAnsi="Times New Roman" w:cs="Times New Roman"/>
+                <w:sz w:val="24"/>
+                <w:szCs w:val="24"/>
+                <w:lang w:val="en-AU"/>
+              </w:rPr>
+              <w:t>GitHub repository with README</w:t>
+            </w:r>
+            <w:r>
+              <w:rPr>
+                <w:rFonts w:ascii="Times New Roman" w:eastAsiaTheme="minorEastAsia" w:hAnsi="Times New Roman" w:cs="Times New Roman"/>
+                <w:sz w:val="24"/>
+                <w:szCs w:val="24"/>
+                <w:lang w:val="en-AU"/>
+              </w:rPr>
+              <w:t>; AWS Academy access confirmed; draft problem statement</w:t>
+            </w:r>
+          </w:p>
+        </w:tc>
+        <w:tc>
+          <w:tcPr>
+            <w:tcW w:w="1643" w:type="dxa"/>
+          </w:tcPr>
+          <w:p>
+            <w:pPr>
+              <w:pStyle w:val="ListParagraph"/>
+              <w:spacing w:before="120" w:after="120" w:line="240" w:lineRule="auto"/>
+              <w:ind w:left="0"/>
+              <w:contextualSpacing w:val="0"/>
+              <w:jc w:val="both"/>
+              <w:rPr>
+                <w:rFonts w:ascii="Times New Roman" w:eastAsiaTheme="minorEastAsia" w:hAnsi="Times New Roman" w:cs="Times New Roman"/>
+                <w:sz w:val="24"/>
+                <w:szCs w:val="24"/>
+                <w:lang w:val="en-AU"/>
+              </w:rPr>
+            </w:pPr>
+            <w:r>
+              <w:rPr>
+                <w:rFonts w:ascii="Times New Roman" w:eastAsiaTheme="minorEastAsia" w:hAnsi="Times New Roman" w:cs="Times New Roman"/>
+                <w:sz w:val="24"/>
+                <w:szCs w:val="24"/>
+                <w:lang w:val="en-AU"/>
+              </w:rPr>
+              <w:t>All</w:t>
+            </w:r>
+          </w:p>
+        </w:tc>
+      </w:tr>
+      <w:tr>
+        <w:tc>
+          <w:tcPr>
+            <w:tcW w:w="804" w:type="dxa"/>
+          </w:tcPr>
+          <w:p>
+            <w:pPr>
+              <w:pStyle w:val="ListParagraph"/>
+              <w:spacing w:before="120" w:after="120" w:line="240" w:lineRule="auto"/>
+              <w:ind w:left="0"/>
+              <w:contextualSpacing w:val="0"/>
+              <w:jc w:val="both"/>
+              <w:rPr>
+                <w:rFonts w:ascii="Times New Roman" w:eastAsiaTheme="minorEastAsia" w:hAnsi="Times New Roman" w:cs="Times New Roman"/>
+                <w:sz w:val="24"/>
+                <w:szCs w:val="24"/>
+                <w:lang w:val="en-AU"/>
+              </w:rPr>
+            </w:pPr>
+            <w:r>
+              <w:rPr>
+                <w:rFonts w:ascii="Times New Roman" w:eastAsiaTheme="minorEastAsia" w:hAnsi="Times New Roman" w:cs="Times New Roman"/>
+                <w:sz w:val="24"/>
+                <w:szCs w:val="24"/>
+                <w:lang w:val="en-AU"/>
+              </w:rPr>
+              <w:t>2</w:t>
+            </w:r>
+          </w:p>
+        </w:tc>
+        <w:tc>
+          <w:tcPr>
+            <w:tcW w:w="3026" w:type="dxa"/>
+          </w:tcPr>
+          <w:p>
+            <w:pPr>
+              <w:pStyle w:val="ListParagraph"/>
+              <w:spacing w:before="120" w:after="120" w:line="240" w:lineRule="auto"/>
+              <w:ind w:left="0"/>
+              <w:contextualSpacing w:val="0"/>
+              <w:jc w:val="both"/>
+              <w:rPr>
+                <w:rFonts w:ascii="Times New Roman" w:eastAsiaTheme="minorEastAsia" w:hAnsi="Times New Roman" w:cs="Times New Roman"/>
+                <w:sz w:val="24"/>
+                <w:szCs w:val="24"/>
+                <w:lang w:val="en-AU"/>
+              </w:rPr>
+            </w:pPr>
+            <w:r>
+              <w:rPr>
+                <w:rFonts w:ascii="Times New Roman" w:eastAsiaTheme="minorEastAsia" w:hAnsi="Times New Roman" w:cs="Times New Roman"/>
+                <w:sz w:val="24"/>
+                <w:szCs w:val="24"/>
+                <w:lang w:val="en-AU"/>
+              </w:rPr>
+              <w:t>Data collection and validation, architecture design</w:t>
+            </w:r>
+          </w:p>
+        </w:tc>
+        <w:tc>
+          <w:tcPr>
+            <w:tcW w:w="3117" w:type="dxa"/>
+          </w:tcPr>
+          <w:p>
+            <w:pPr>
+              <w:pStyle w:val="ListParagraph"/>
+              <w:spacing w:before="120" w:after="120" w:line="240" w:lineRule="auto"/>
+              <w:ind w:left="0"/>
+              <w:contextualSpacing w:val="0"/>
+              <w:jc w:val="both"/>
+              <w:rPr>
+                <w:rFonts w:ascii="Times New Roman" w:eastAsiaTheme="minorEastAsia" w:hAnsi="Times New Roman" w:cs="Times New Roman"/>
+                <w:sz w:val="24"/>
+                <w:szCs w:val="24"/>
+                <w:lang w:val="en-AU"/>
+              </w:rPr>
+            </w:pPr>
+            <w:r>
+              <w:rPr>
+                <w:rFonts w:ascii="Times New Roman" w:eastAsiaTheme="minorEastAsia" w:hAnsi="Times New Roman" w:cs="Times New Roman"/>
+                <w:sz w:val="24"/>
+                <w:szCs w:val="24"/>
+                <w:lang w:val="en-AU"/>
+              </w:rPr>
+              <w:t>Architecture diagram; project management board populated; confirmed data sources</w:t>
+            </w:r>
+          </w:p>
+        </w:tc>
+        <w:tc>
+          <w:tcPr>
+            <w:tcW w:w="1643" w:type="dxa"/>
+          </w:tcPr>
+          <w:p>
+            <w:pPr>
+              <w:pStyle w:val="ListParagraph"/>
+              <w:spacing w:before="120" w:after="120" w:line="240" w:lineRule="auto"/>
+              <w:ind w:left="0"/>
+              <w:contextualSpacing w:val="0"/>
+              <w:jc w:val="both"/>
+              <w:rPr>
+                <w:rFonts w:ascii="Times New Roman" w:eastAsiaTheme="minorEastAsia" w:hAnsi="Times New Roman" w:cs="Times New Roman"/>
+                <w:sz w:val="24"/>
+                <w:szCs w:val="24"/>
+                <w:lang w:val="en-AU"/>
+              </w:rPr>
+            </w:pPr>
+            <w:r>
+              <w:rPr>
+                <w:rFonts w:ascii="Times New Roman" w:eastAsiaTheme="minorEastAsia" w:hAnsi="Times New Roman" w:cs="Times New Roman"/>
+                <w:sz w:val="24"/>
+                <w:szCs w:val="24"/>
+                <w:lang w:val="en-AU"/>
+              </w:rPr>
+              <w:t>All</w:t>
+            </w:r>
+          </w:p>
+        </w:tc>
+      </w:tr>
+      <w:tr>
+        <w:tc>
+          <w:tcPr>
+            <w:tcW w:w="804" w:type="dxa"/>
+            <w:shd w:val="clear" w:color="auto" w:fill="DBE5F1" w:themeFill="accent1" w:themeFillTint="33"/>
+          </w:tcPr>
+          <w:p>
+            <w:pPr>
+              <w:pStyle w:val="ListParagraph"/>
+              <w:spacing w:before="120" w:after="120" w:line="240" w:lineRule="auto"/>
+              <w:ind w:left="0"/>
+              <w:contextualSpacing w:val="0"/>
+              <w:jc w:val="both"/>
+              <w:rPr>
+                <w:rFonts w:ascii="Times New Roman" w:eastAsiaTheme="minorEastAsia" w:hAnsi="Times New Roman" w:cs="Times New Roman"/>
+                <w:b/>
+                <w:bCs/>
+                <w:sz w:val="24"/>
+                <w:szCs w:val="24"/>
+                <w:lang w:val="en-AU"/>
+              </w:rPr>
+            </w:pPr>
+            <w:r>
+              <w:rPr>
+                <w:rFonts w:ascii="Times New Roman" w:eastAsiaTheme="minorEastAsia" w:hAnsi="Times New Roman" w:cs="Times New Roman"/>
+                <w:b/>
+                <w:bCs/>
+                <w:sz w:val="24"/>
+                <w:szCs w:val="24"/>
+                <w:lang w:val="en-AU"/>
+              </w:rPr>
+              <w:t>3</w:t>
+            </w:r>
+          </w:p>
+        </w:tc>
+        <w:tc>
+          <w:tcPr>
+            <w:tcW w:w="3026" w:type="dxa"/>
+            <w:shd w:val="clear" w:color="auto" w:fill="DBE5F1" w:themeFill="accent1" w:themeFillTint="33"/>
+          </w:tcPr>
+          <w:p>
+            <w:pPr>
+              <w:pStyle w:val="ListParagraph"/>
+              <w:spacing w:before="120" w:after="120" w:line="240" w:lineRule="auto"/>
+              <w:ind w:left="0"/>
+              <w:contextualSpacing w:val="0"/>
+              <w:jc w:val="both"/>
+              <w:rPr>
+                <w:rFonts w:ascii="Times New Roman" w:eastAsiaTheme="minorEastAsia" w:hAnsi="Times New Roman" w:cs="Times New Roman"/>
+                <w:b/>
+                <w:bCs/>
+                <w:sz w:val="24"/>
+                <w:szCs w:val="24"/>
+                <w:lang w:val="en-AU"/>
+              </w:rPr>
+            </w:pPr>
+            <w:r>
+              <w:rPr>
+                <w:rFonts w:ascii="Times New Roman" w:eastAsiaTheme="minorEastAsia" w:hAnsi="Times New Roman" w:cs="Times New Roman"/>
+                <w:b/>
+                <w:bCs/>
+                <w:sz w:val="24"/>
+                <w:szCs w:val="24"/>
+                <w:lang w:val="en-AU"/>
+              </w:rPr>
+              <w:t>Proposal writing and initial risk analysis</w:t>
+            </w:r>
+          </w:p>
+        </w:tc>
+        <w:tc>
+          <w:tcPr>
+            <w:tcW w:w="3117" w:type="dxa"/>
+            <w:shd w:val="clear" w:color="auto" w:fill="DBE5F1" w:themeFill="accent1" w:themeFillTint="33"/>
+          </w:tcPr>
+          <w:p>
+            <w:pPr>
+              <w:pStyle w:val="ListParagraph"/>
+              <w:spacing w:before="120" w:after="120" w:line="240" w:lineRule="auto"/>
+              <w:ind w:left="0"/>
+              <w:contextualSpacing w:val="0"/>
+              <w:jc w:val="both"/>
+              <w:rPr>
+                <w:rFonts w:ascii="Times New Roman" w:eastAsiaTheme="minorEastAsia" w:hAnsi="Times New Roman" w:cs="Times New Roman"/>
+                <w:b/>
+                <w:bCs/>
+                <w:sz w:val="24"/>
+                <w:szCs w:val="24"/>
+                <w:lang w:val="en-AU"/>
+              </w:rPr>
+            </w:pPr>
+            <w:r>
+              <w:rPr>
+                <w:rFonts w:ascii="Times New Roman" w:eastAsiaTheme="minorEastAsia" w:hAnsi="Times New Roman" w:cs="Times New Roman"/>
+                <w:b/>
+                <w:bCs/>
+                <w:sz w:val="24"/>
+                <w:szCs w:val="24"/>
+                <w:lang w:val="en-AU"/>
+              </w:rPr>
+              <w:t>Assessment 1 submitted</w:t>
+            </w:r>
+            <w:r>
+              <w:rPr>
+                <w:rFonts w:ascii="Times New Roman" w:eastAsiaTheme="minorEastAsia" w:hAnsi="Times New Roman" w:cs="Times New Roman"/>
+                <w:b/>
+                <w:bCs/>
+                <w:sz w:val="24"/>
+                <w:szCs w:val="24"/>
+                <w:lang w:val="en-AU"/>
+              </w:rPr>
+              <w:t>: Project proposal and design</w:t>
+            </w:r>
+          </w:p>
+        </w:tc>
+        <w:tc>
+          <w:tcPr>
+            <w:tcW w:w="1643" w:type="dxa"/>
+            <w:shd w:val="clear" w:color="auto" w:fill="DBE5F1" w:themeFill="accent1" w:themeFillTint="33"/>
+          </w:tcPr>
+          <w:p>
+            <w:pPr>
+              <w:pStyle w:val="ListParagraph"/>
+              <w:spacing w:before="120" w:after="120" w:line="240" w:lineRule="auto"/>
+              <w:ind w:left="0"/>
+              <w:contextualSpacing w:val="0"/>
+              <w:jc w:val="both"/>
+              <w:rPr>
+                <w:rFonts w:ascii="Times New Roman" w:eastAsiaTheme="minorEastAsia" w:hAnsi="Times New Roman" w:cs="Times New Roman"/>
+                <w:b/>
+                <w:bCs/>
+                <w:sz w:val="24"/>
+                <w:szCs w:val="24"/>
+                <w:lang w:val="en-AU"/>
+              </w:rPr>
+            </w:pPr>
+            <w:r>
+              <w:rPr>
+                <w:rFonts w:ascii="Times New Roman" w:eastAsiaTheme="minorEastAsia" w:hAnsi="Times New Roman" w:cs="Times New Roman"/>
+                <w:b/>
+                <w:bCs/>
+                <w:sz w:val="24"/>
+                <w:szCs w:val="24"/>
+                <w:lang w:val="en-AU"/>
+              </w:rPr>
+              <w:t>All</w:t>
+            </w:r>
+          </w:p>
+        </w:tc>
+      </w:tr>
+      <w:tr>
+        <w:tc>
+          <w:tcPr>
+            <w:tcW w:w="804" w:type="dxa"/>
+          </w:tcPr>
+          <w:p>
+            <w:pPr>
+              <w:pStyle w:val="ListParagraph"/>
+              <w:spacing w:before="120" w:after="120" w:line="240" w:lineRule="auto"/>
+              <w:ind w:left="0"/>
+              <w:contextualSpacing w:val="0"/>
+              <w:jc w:val="both"/>
+              <w:rPr>
+                <w:rFonts w:ascii="Times New Roman" w:eastAsiaTheme="minorEastAsia" w:hAnsi="Times New Roman" w:cs="Times New Roman"/>
+                <w:sz w:val="24"/>
+                <w:szCs w:val="24"/>
+                <w:lang w:val="en-AU"/>
+              </w:rPr>
+            </w:pPr>
+            <w:r>
+              <w:rPr>
+                <w:rFonts w:ascii="Times New Roman" w:eastAsiaTheme="minorEastAsia" w:hAnsi="Times New Roman" w:cs="Times New Roman"/>
+                <w:sz w:val="24"/>
+                <w:szCs w:val="24"/>
+                <w:lang w:val="en-AU"/>
+              </w:rPr>
+              <w:t>4</w:t>
+            </w:r>
+          </w:p>
+        </w:tc>
+        <w:tc>
+          <w:tcPr>
+            <w:tcW w:w="3026" w:type="dxa"/>
+          </w:tcPr>
+          <w:p>
+            <w:pPr>
+              <w:pStyle w:val="ListParagraph"/>
+              <w:spacing w:before="120" w:after="120" w:line="240" w:lineRule="auto"/>
+              <w:ind w:left="0"/>
+              <w:contextualSpacing w:val="0"/>
+              <w:jc w:val="both"/>
+              <w:rPr>
+                <w:rFonts w:ascii="Times New Roman" w:eastAsiaTheme="minorEastAsia" w:hAnsi="Times New Roman" w:cs="Times New Roman"/>
+                <w:sz w:val="24"/>
+                <w:szCs w:val="24"/>
+                <w:lang w:val="en-AU"/>
+              </w:rPr>
+            </w:pPr>
+            <w:r>
+              <w:rPr>
+                <w:rFonts w:ascii="Times New Roman" w:eastAsiaTheme="minorEastAsia" w:hAnsi="Times New Roman" w:cs="Times New Roman"/>
+                <w:sz w:val="24"/>
+                <w:szCs w:val="24"/>
+                <w:lang w:val="en-AU"/>
+              </w:rPr>
+              <w:t xml:space="preserve">Clean and harmonise five </w:t>
+            </w:r>
+            <w:r>
+              <w:rPr>
+                <w:rFonts w:ascii="Times New Roman" w:eastAsiaTheme="minorEastAsia" w:hAnsi="Times New Roman" w:cs="Times New Roman"/>
+                <w:sz w:val="24"/>
+                <w:szCs w:val="24"/>
+                <w:lang w:val="en-AU"/>
+              </w:rPr>
+              <w:t>years of multi-source data; resolve region-mapping and data-regime discontinuities.</w:t>
+            </w:r>
+          </w:p>
+        </w:tc>
+        <w:tc>
+          <w:tcPr>
+            <w:tcW w:w="3117" w:type="dxa"/>
+          </w:tcPr>
+          <w:p>
+            <w:pPr>
+              <w:pStyle w:val="ListParagraph"/>
+              <w:spacing w:before="120" w:after="120" w:line="240" w:lineRule="auto"/>
+              <w:ind w:left="0"/>
+              <w:contextualSpacing w:val="0"/>
+              <w:jc w:val="both"/>
+              <w:rPr>
+                <w:rFonts w:ascii="Times New Roman" w:eastAsiaTheme="minorEastAsia" w:hAnsi="Times New Roman" w:cs="Times New Roman"/>
+                <w:sz w:val="24"/>
+                <w:szCs w:val="24"/>
+                <w:lang w:val="en-AU"/>
+              </w:rPr>
+            </w:pPr>
+            <w:r>
+              <w:rPr>
+                <w:rFonts w:ascii="Times New Roman" w:eastAsiaTheme="minorEastAsia" w:hAnsi="Times New Roman" w:cs="Times New Roman"/>
+                <w:sz w:val="24"/>
+                <w:szCs w:val="24"/>
+                <w:lang w:val="en-AU"/>
+              </w:rPr>
+              <w:t>Cleaned, merged dataset in progress</w:t>
+            </w:r>
+          </w:p>
+        </w:tc>
+        <w:tc>
+          <w:tcPr>
+            <w:tcW w:w="1643" w:type="dxa"/>
+          </w:tcPr>
+          <w:p>
+            <w:pPr>
+              <w:pStyle w:val="ListParagraph"/>
+              <w:spacing w:before="120" w:after="120" w:line="240" w:lineRule="auto"/>
+              <w:ind w:left="0"/>
+              <w:contextualSpacing w:val="0"/>
+              <w:jc w:val="both"/>
+              <w:rPr>
+                <w:rFonts w:ascii="Times New Roman" w:eastAsiaTheme="minorEastAsia" w:hAnsi="Times New Roman" w:cs="Times New Roman"/>
+                <w:sz w:val="24"/>
+                <w:szCs w:val="24"/>
+                <w:lang w:val="en-AU"/>
+              </w:rPr>
+            </w:pPr>
+            <w:r>
+              <w:rPr>
+                <w:rFonts w:ascii="Times New Roman" w:eastAsiaTheme="minorEastAsia" w:hAnsi="Times New Roman" w:cs="Times New Roman"/>
+                <w:sz w:val="24"/>
+                <w:szCs w:val="24"/>
+                <w:lang w:val="en-AU"/>
+              </w:rPr>
+              <w:t xml:space="preserve"> </w:t>
+            </w:r>
+            <w:r>
+              <w:rPr>
+                <w:rFonts w:ascii="Times New Roman" w:eastAsiaTheme="minorEastAsia" w:hAnsi="Times New Roman" w:cs="Times New Roman"/>
+                <w:sz w:val="24"/>
+                <w:szCs w:val="24"/>
+                <w:lang w:val="en-AU"/>
+              </w:rPr>
+              <w:t>(Ingest)</w:t>
+            </w:r>
+          </w:p>
+          <w:p>
+            <w:pPr>
+              <w:pStyle w:val="ListParagraph"/>
+              <w:spacing w:before="120" w:after="120" w:line="240" w:lineRule="auto"/>
+              <w:ind w:left="0"/>
+              <w:contextualSpacing w:val="0"/>
+              <w:jc w:val="both"/>
+              <w:rPr>
+                <w:rFonts w:ascii="Times New Roman" w:eastAsiaTheme="minorEastAsia" w:hAnsi="Times New Roman" w:cs="Times New Roman"/>
+                <w:sz w:val="24"/>
+                <w:szCs w:val="24"/>
+                <w:lang w:val="en-AU"/>
+              </w:rPr>
+            </w:pPr>
+            <w:r>
+              <w:rPr>
+                <w:rFonts w:ascii="Times New Roman" w:eastAsiaTheme="minorEastAsia" w:hAnsi="Times New Roman" w:cs="Times New Roman"/>
+                <w:sz w:val="24"/>
+                <w:szCs w:val="24"/>
+                <w:lang w:val="en-AU"/>
+              </w:rPr>
+              <w:t xml:space="preserve"> (Store)</w:t>
+            </w:r>
+          </w:p>
+        </w:tc>
+      </w:tr>
+      <w:tr>
+        <w:tc>
+          <w:tcPr>
+            <w:tcW w:w="804" w:type="dxa"/>
+          </w:tcPr>
+          <w:p>
+            <w:pPr>
+              <w:pStyle w:val="ListParagraph"/>
+              <w:spacing w:before="120" w:after="120" w:line="240" w:lineRule="auto"/>
+              <w:ind w:left="0"/>
+              <w:contextualSpacing w:val="0"/>
+              <w:jc w:val="both"/>
+              <w:rPr>
+                <w:rFonts w:ascii="Times New Roman" w:eastAsiaTheme="minorEastAsia" w:hAnsi="Times New Roman" w:cs="Times New Roman"/>
+                <w:sz w:val="24"/>
+                <w:szCs w:val="24"/>
+                <w:lang w:val="en-AU"/>
+              </w:rPr>
+            </w:pPr>
+            <w:r>
+              <w:rPr>
+                <w:rFonts w:ascii="Times New Roman" w:eastAsiaTheme="minorEastAsia" w:hAnsi="Times New Roman" w:cs="Times New Roman"/>
+                <w:sz w:val="24"/>
+                <w:szCs w:val="24"/>
+                <w:lang w:val="en-AU"/>
+              </w:rPr>
+              <w:lastRenderedPageBreak/>
+              <w:t>5</w:t>
+            </w:r>
+          </w:p>
+        </w:tc>
+        <w:tc>
+          <w:tcPr>
+            <w:tcW w:w="3026" w:type="dxa"/>
+          </w:tcPr>
+          <w:p>
+            <w:pPr>
+              <w:pStyle w:val="ListParagraph"/>
+              <w:spacing w:before="120" w:after="120" w:line="240" w:lineRule="auto"/>
+              <w:ind w:left="0"/>
+              <w:contextualSpacing w:val="0"/>
+              <w:jc w:val="both"/>
+              <w:rPr>
+                <w:rFonts w:ascii="Times New Roman" w:eastAsiaTheme="minorEastAsia" w:hAnsi="Times New Roman" w:cs="Times New Roman"/>
+                <w:sz w:val="24"/>
+                <w:szCs w:val="24"/>
+                <w:lang w:val="en-AU"/>
+              </w:rPr>
+            </w:pPr>
+            <w:r>
+              <w:rPr>
+                <w:rFonts w:ascii="Times New Roman" w:eastAsiaTheme="minorEastAsia" w:hAnsi="Times New Roman" w:cs="Times New Roman"/>
+                <w:sz w:val="24"/>
+                <w:szCs w:val="24"/>
+                <w:lang w:val="en-AU"/>
+              </w:rPr>
+              <w:t>Build cloud pipeline: ingestion, cataloguing and querying operational;</w:t>
+            </w:r>
+            <w:r>
+              <w:rPr>
+                <w:rFonts w:ascii="Times New Roman" w:eastAsiaTheme="minorEastAsia" w:hAnsi="Times New Roman" w:cs="Times New Roman"/>
+                <w:sz w:val="24"/>
+                <w:szCs w:val="24"/>
+                <w:lang w:val="en-AU"/>
+              </w:rPr>
+              <w:t xml:space="preserve"> preliminary exploratory analysis.</w:t>
+            </w:r>
+          </w:p>
+        </w:tc>
+        <w:tc>
+          <w:tcPr>
+            <w:tcW w:w="3117" w:type="dxa"/>
+          </w:tcPr>
+          <w:p>
+            <w:pPr>
+              <w:pStyle w:val="ListParagraph"/>
+              <w:spacing w:before="120" w:after="120" w:line="240" w:lineRule="auto"/>
+              <w:ind w:left="0"/>
+              <w:contextualSpacing w:val="0"/>
+              <w:jc w:val="both"/>
+              <w:rPr>
+                <w:rFonts w:ascii="Times New Roman" w:eastAsiaTheme="minorEastAsia" w:hAnsi="Times New Roman" w:cs="Times New Roman"/>
+                <w:sz w:val="24"/>
+                <w:szCs w:val="24"/>
+                <w:lang w:val="en-AU"/>
+              </w:rPr>
+            </w:pPr>
+            <w:r>
+              <w:rPr>
+                <w:rFonts w:ascii="Times New Roman" w:eastAsiaTheme="minorEastAsia" w:hAnsi="Times New Roman" w:cs="Times New Roman"/>
+                <w:sz w:val="24"/>
+                <w:szCs w:val="24"/>
+                <w:lang w:val="en-AU"/>
+              </w:rPr>
+              <w:t>Working ingest/ store/ query stages; EDA notebook</w:t>
+            </w:r>
+          </w:p>
+        </w:tc>
+        <w:tc>
+          <w:tcPr>
+            <w:tcW w:w="1643" w:type="dxa"/>
+          </w:tcPr>
+          <w:p>
+            <w:pPr>
+              <w:pStyle w:val="ListParagraph"/>
+              <w:spacing w:before="120" w:after="120" w:line="240" w:lineRule="auto"/>
+              <w:ind w:left="0"/>
+              <w:contextualSpacing w:val="0"/>
+              <w:jc w:val="both"/>
+              <w:rPr>
+                <w:rFonts w:ascii="Times New Roman" w:eastAsiaTheme="minorEastAsia" w:hAnsi="Times New Roman" w:cs="Times New Roman"/>
+                <w:sz w:val="24"/>
+                <w:szCs w:val="24"/>
+                <w:lang w:val="en-AU"/>
+              </w:rPr>
+            </w:pPr>
+            <w:r>
+              <w:rPr>
+                <w:rFonts w:ascii="Times New Roman" w:eastAsiaTheme="minorEastAsia" w:hAnsi="Times New Roman" w:cs="Times New Roman"/>
+                <w:sz w:val="24"/>
+                <w:szCs w:val="24"/>
+                <w:lang w:val="en-AU"/>
+              </w:rPr>
+              <w:t xml:space="preserve"> (Ingest)</w:t>
+            </w:r>
+          </w:p>
+          <w:p>
+            <w:pPr>
+              <w:pStyle w:val="ListParagraph"/>
+              <w:spacing w:before="120" w:after="120" w:line="240" w:lineRule="auto"/>
+              <w:ind w:left="0"/>
+              <w:contextualSpacing w:val="0"/>
+              <w:jc w:val="both"/>
+              <w:rPr>
+                <w:rFonts w:ascii="Times New Roman" w:eastAsiaTheme="minorEastAsia" w:hAnsi="Times New Roman" w:cs="Times New Roman"/>
+                <w:sz w:val="24"/>
+                <w:szCs w:val="24"/>
+                <w:lang w:val="en-AU"/>
+              </w:rPr>
+            </w:pPr>
+            <w:r>
+              <w:rPr>
+                <w:rFonts w:ascii="Times New Roman" w:eastAsiaTheme="minorEastAsia" w:hAnsi="Times New Roman" w:cs="Times New Roman"/>
+                <w:sz w:val="24"/>
+                <w:szCs w:val="24"/>
+                <w:lang w:val="en-AU"/>
+              </w:rPr>
+              <w:t xml:space="preserve"> (Store)</w:t>
+            </w:r>
+          </w:p>
+          <w:p>
+            <w:pPr>
+              <w:pStyle w:val="ListParagraph"/>
+              <w:spacing w:before="120" w:after="120" w:line="240" w:lineRule="auto"/>
+              <w:ind w:left="0"/>
+              <w:contextualSpacing w:val="0"/>
+              <w:jc w:val="both"/>
+              <w:rPr>
+                <w:rFonts w:ascii="Times New Roman" w:eastAsiaTheme="minorEastAsia" w:hAnsi="Times New Roman" w:cs="Times New Roman"/>
+                <w:sz w:val="24"/>
+                <w:szCs w:val="24"/>
+                <w:lang w:val="en-AU"/>
+              </w:rPr>
+            </w:pPr>
+            <w:r>
+              <w:rPr>
+                <w:rFonts w:ascii="Times New Roman" w:eastAsiaTheme="minorEastAsia" w:hAnsi="Times New Roman" w:cs="Times New Roman"/>
+                <w:sz w:val="24"/>
+                <w:szCs w:val="24"/>
+                <w:lang w:val="en-AU"/>
+              </w:rPr>
+              <w:t xml:space="preserve"> (Query)</w:t>
+            </w:r>
+          </w:p>
+        </w:tc>
+      </w:tr>
+      <w:tr>
+        <w:tc>
+          <w:tcPr>
+            <w:tcW w:w="804" w:type="dxa"/>
+            <w:shd w:val="clear" w:color="auto" w:fill="DBE5F1" w:themeFill="accent1" w:themeFillTint="33"/>
+          </w:tcPr>
+          <w:p>
+            <w:pPr>
+              <w:pStyle w:val="ListParagraph"/>
+              <w:spacing w:before="120" w:after="120" w:line="240" w:lineRule="auto"/>
+              <w:ind w:left="0"/>
+              <w:contextualSpacing w:val="0"/>
+              <w:jc w:val="both"/>
+              <w:rPr>
+                <w:rFonts w:ascii="Times New Roman" w:eastAsiaTheme="minorEastAsia" w:hAnsi="Times New Roman" w:cs="Times New Roman"/>
+                <w:b/>
+                <w:bCs/>
+                <w:sz w:val="24"/>
+                <w:szCs w:val="24"/>
+                <w:lang w:val="en-AU"/>
+              </w:rPr>
+            </w:pPr>
+            <w:r>
+              <w:rPr>
+                <w:rFonts w:ascii="Times New Roman" w:eastAsiaTheme="minorEastAsia" w:hAnsi="Times New Roman" w:cs="Times New Roman"/>
+                <w:b/>
+                <w:bCs/>
+                <w:sz w:val="24"/>
+                <w:szCs w:val="24"/>
+                <w:lang w:val="en-AU"/>
+              </w:rPr>
+              <w:t>6</w:t>
+            </w:r>
+          </w:p>
+        </w:tc>
+        <w:tc>
+          <w:tcPr>
+            <w:tcW w:w="3026" w:type="dxa"/>
+            <w:shd w:val="clear" w:color="auto" w:fill="DBE5F1" w:themeFill="accent1" w:themeFillTint="33"/>
+          </w:tcPr>
+          <w:p>
+            <w:pPr>
+              <w:pStyle w:val="ListParagraph"/>
+              <w:spacing w:before="120" w:after="120" w:line="240" w:lineRule="auto"/>
+              <w:ind w:left="0"/>
+              <w:contextualSpacing w:val="0"/>
+              <w:jc w:val="both"/>
+              <w:rPr>
+                <w:rFonts w:ascii="Times New Roman" w:eastAsiaTheme="minorEastAsia" w:hAnsi="Times New Roman" w:cs="Times New Roman"/>
+                <w:b/>
+                <w:bCs/>
+                <w:sz w:val="24"/>
+                <w:szCs w:val="24"/>
+                <w:lang w:val="en-AU"/>
+              </w:rPr>
+            </w:pPr>
+            <w:r>
+              <w:rPr>
+                <w:rFonts w:ascii="Times New Roman" w:eastAsiaTheme="minorEastAsia" w:hAnsi="Times New Roman" w:cs="Times New Roman"/>
+                <w:b/>
+                <w:bCs/>
+                <w:sz w:val="24"/>
+                <w:szCs w:val="24"/>
+                <w:lang w:val="en-AU"/>
+              </w:rPr>
+              <w:t>Consolidate pipeline evidence and baseline model into progress report</w:t>
+            </w:r>
+          </w:p>
+        </w:tc>
+        <w:tc>
+          <w:tcPr>
+            <w:tcW w:w="3117" w:type="dxa"/>
+            <w:shd w:val="clear" w:color="auto" w:fill="DBE5F1" w:themeFill="accent1" w:themeFillTint="33"/>
+          </w:tcPr>
+          <w:p>
+            <w:pPr>
+              <w:pStyle w:val="ListParagraph"/>
+              <w:spacing w:before="120" w:after="120" w:line="240" w:lineRule="auto"/>
+              <w:ind w:left="0"/>
+              <w:contextualSpacing w:val="0"/>
+              <w:jc w:val="both"/>
+              <w:rPr>
+                <w:rFonts w:ascii="Times New Roman" w:eastAsiaTheme="minorEastAsia" w:hAnsi="Times New Roman" w:cs="Times New Roman"/>
+                <w:b/>
+                <w:bCs/>
+                <w:sz w:val="24"/>
+                <w:szCs w:val="24"/>
+                <w:lang w:val="en-AU"/>
+              </w:rPr>
+            </w:pPr>
+            <w:r>
+              <w:rPr>
+                <w:rFonts w:ascii="Times New Roman" w:eastAsiaTheme="minorEastAsia" w:hAnsi="Times New Roman" w:cs="Times New Roman"/>
+                <w:b/>
+                <w:bCs/>
+                <w:sz w:val="24"/>
+                <w:szCs w:val="24"/>
+                <w:lang w:val="en-AU"/>
+              </w:rPr>
+              <w:t>Assessment 2 submitted</w:t>
+            </w:r>
+            <w:r>
+              <w:rPr>
+                <w:rFonts w:ascii="Times New Roman" w:eastAsiaTheme="minorEastAsia" w:hAnsi="Times New Roman" w:cs="Times New Roman"/>
+                <w:b/>
+                <w:bCs/>
+                <w:sz w:val="24"/>
+                <w:szCs w:val="24"/>
+                <w:lang w:val="en-AU"/>
+              </w:rPr>
+              <w:t>: Progress report and development</w:t>
+            </w:r>
+          </w:p>
+        </w:tc>
+        <w:tc>
+          <w:tcPr>
+            <w:tcW w:w="1643" w:type="dxa"/>
+            <w:shd w:val="clear" w:color="auto" w:fill="DBE5F1" w:themeFill="accent1" w:themeFillTint="33"/>
+          </w:tcPr>
+          <w:p>
+            <w:pPr>
+              <w:pStyle w:val="ListParagraph"/>
+              <w:spacing w:before="120" w:after="120" w:line="240" w:lineRule="auto"/>
+              <w:ind w:left="0"/>
+              <w:contextualSpacing w:val="0"/>
+              <w:jc w:val="both"/>
+              <w:rPr>
+                <w:rFonts w:ascii="Times New Roman" w:eastAsiaTheme="minorEastAsia" w:hAnsi="Times New Roman" w:cs="Times New Roman"/>
+                <w:b/>
+                <w:bCs/>
+                <w:sz w:val="24"/>
+                <w:szCs w:val="24"/>
+                <w:lang w:val="en-AU"/>
+              </w:rPr>
+            </w:pPr>
+            <w:r>
+              <w:rPr>
+                <w:rFonts w:ascii="Times New Roman" w:eastAsiaTheme="minorEastAsia" w:hAnsi="Times New Roman" w:cs="Times New Roman"/>
+                <w:b/>
+                <w:bCs/>
+                <w:sz w:val="24"/>
+                <w:szCs w:val="24"/>
+                <w:lang w:val="en-AU"/>
+              </w:rPr>
+              <w:t>All</w:t>
+            </w:r>
+          </w:p>
+        </w:tc>
+      </w:tr>
+      <w:tr>
+        <w:tc>
+          <w:tcPr>
+            <w:tcW w:w="804" w:type="dxa"/>
+          </w:tcPr>
+          <w:p>
+            <w:pPr>
+              <w:pStyle w:val="ListParagraph"/>
+              <w:spacing w:before="120" w:after="120" w:line="240" w:lineRule="auto"/>
+              <w:ind w:left="0"/>
+              <w:contextualSpacing w:val="0"/>
+              <w:jc w:val="both"/>
+              <w:rPr>
+                <w:rFonts w:ascii="Times New Roman" w:eastAsiaTheme="minorEastAsia" w:hAnsi="Times New Roman" w:cs="Times New Roman"/>
+                <w:sz w:val="24"/>
+                <w:szCs w:val="24"/>
+                <w:lang w:val="en-AU"/>
+              </w:rPr>
+            </w:pPr>
+            <w:r>
+              <w:rPr>
+                <w:rFonts w:ascii="Times New Roman" w:eastAsiaTheme="minorEastAsia" w:hAnsi="Times New Roman" w:cs="Times New Roman"/>
+                <w:sz w:val="24"/>
+                <w:szCs w:val="24"/>
+                <w:lang w:val="en-AU"/>
+              </w:rPr>
+              <w:t>7</w:t>
+            </w:r>
+          </w:p>
+        </w:tc>
+        <w:tc>
+          <w:tcPr>
+            <w:tcW w:w="3026" w:type="dxa"/>
+          </w:tcPr>
+          <w:p>
+            <w:pPr>
+              <w:pStyle w:val="ListParagraph"/>
+              <w:spacing w:before="120" w:after="120" w:line="240" w:lineRule="auto"/>
+              <w:ind w:left="0"/>
+              <w:contextualSpacing w:val="0"/>
+              <w:jc w:val="both"/>
+              <w:rPr>
+                <w:rFonts w:ascii="Times New Roman" w:eastAsiaTheme="minorEastAsia" w:hAnsi="Times New Roman" w:cs="Times New Roman"/>
+                <w:sz w:val="24"/>
+                <w:szCs w:val="24"/>
+                <w:lang w:val="en-AU"/>
+              </w:rPr>
+            </w:pPr>
+            <w:r>
+              <w:rPr>
+                <w:rFonts w:ascii="Times New Roman" w:eastAsiaTheme="minorEastAsia" w:hAnsi="Times New Roman" w:cs="Times New Roman"/>
+                <w:sz w:val="24"/>
+                <w:szCs w:val="24"/>
+                <w:lang w:val="en-AU"/>
+              </w:rPr>
+              <w:t>Feature engineering: lagged indicators, cyclica</w:t>
+            </w:r>
+            <w:r>
+              <w:rPr>
+                <w:rFonts w:ascii="Times New Roman" w:eastAsiaTheme="minorEastAsia" w:hAnsi="Times New Roman" w:cs="Times New Roman"/>
+                <w:sz w:val="24"/>
+                <w:szCs w:val="24"/>
+                <w:lang w:val="en-AU"/>
+              </w:rPr>
+              <w:t>l encoding, per-capita normalisation</w:t>
+            </w:r>
+          </w:p>
+        </w:tc>
+        <w:tc>
+          <w:tcPr>
+            <w:tcW w:w="3117" w:type="dxa"/>
+          </w:tcPr>
+          <w:p>
+            <w:pPr>
+              <w:pStyle w:val="ListParagraph"/>
+              <w:spacing w:before="120" w:after="120" w:line="240" w:lineRule="auto"/>
+              <w:ind w:left="0"/>
+              <w:contextualSpacing w:val="0"/>
+              <w:jc w:val="both"/>
+              <w:rPr>
+                <w:rFonts w:ascii="Times New Roman" w:eastAsiaTheme="minorEastAsia" w:hAnsi="Times New Roman" w:cs="Times New Roman"/>
+                <w:sz w:val="24"/>
+                <w:szCs w:val="24"/>
+                <w:lang w:val="en-AU"/>
+              </w:rPr>
+            </w:pPr>
+            <w:r>
+              <w:rPr>
+                <w:rFonts w:ascii="Times New Roman" w:eastAsiaTheme="minorEastAsia" w:hAnsi="Times New Roman" w:cs="Times New Roman"/>
+                <w:sz w:val="24"/>
+                <w:szCs w:val="24"/>
+                <w:lang w:val="en-AU"/>
+              </w:rPr>
+              <w:t>Feature set finalised for modelling</w:t>
+            </w:r>
+          </w:p>
+        </w:tc>
+        <w:tc>
+          <w:tcPr>
+            <w:tcW w:w="1643" w:type="dxa"/>
+          </w:tcPr>
+          <w:p>
+            <w:pPr>
+              <w:pStyle w:val="ListParagraph"/>
+              <w:spacing w:before="120" w:after="120" w:line="240" w:lineRule="auto"/>
+              <w:ind w:left="0"/>
+              <w:contextualSpacing w:val="0"/>
+              <w:jc w:val="both"/>
+              <w:rPr>
+                <w:rFonts w:ascii="Times New Roman" w:eastAsiaTheme="minorEastAsia" w:hAnsi="Times New Roman" w:cs="Times New Roman"/>
+                <w:sz w:val="24"/>
+                <w:szCs w:val="24"/>
+                <w:lang w:val="en-AU"/>
+              </w:rPr>
+            </w:pPr>
+            <w:r>
+              <w:rPr>
+                <w:rFonts w:ascii="Times New Roman" w:eastAsiaTheme="minorEastAsia" w:hAnsi="Times New Roman" w:cs="Times New Roman"/>
+                <w:sz w:val="24"/>
+                <w:szCs w:val="24"/>
+                <w:lang w:val="en-AU"/>
+              </w:rPr>
+              <w:t xml:space="preserve"> (Model)</w:t>
+            </w:r>
+          </w:p>
+        </w:tc>
+      </w:tr>
+      <w:tr>
+        <w:tc>
+          <w:tcPr>
+            <w:tcW w:w="804" w:type="dxa"/>
+          </w:tcPr>
+          <w:p>
+            <w:pPr>
+              <w:pStyle w:val="ListParagraph"/>
+              <w:spacing w:before="120" w:after="120" w:line="240" w:lineRule="auto"/>
+              <w:ind w:left="0"/>
+              <w:contextualSpacing w:val="0"/>
+              <w:jc w:val="both"/>
+              <w:rPr>
+                <w:rFonts w:ascii="Times New Roman" w:eastAsiaTheme="minorEastAsia" w:hAnsi="Times New Roman" w:cs="Times New Roman"/>
+                <w:sz w:val="24"/>
+                <w:szCs w:val="24"/>
+                <w:lang w:val="en-AU"/>
+              </w:rPr>
+            </w:pPr>
+            <w:r>
+              <w:rPr>
+                <w:rFonts w:ascii="Times New Roman" w:eastAsiaTheme="minorEastAsia" w:hAnsi="Times New Roman" w:cs="Times New Roman"/>
+                <w:sz w:val="24"/>
+                <w:szCs w:val="24"/>
+                <w:lang w:val="en-AU"/>
+              </w:rPr>
+              <w:t>8</w:t>
+            </w:r>
+          </w:p>
+        </w:tc>
+        <w:tc>
+          <w:tcPr>
+            <w:tcW w:w="3026" w:type="dxa"/>
+          </w:tcPr>
+          <w:p>
+            <w:pPr>
+              <w:pStyle w:val="ListParagraph"/>
+              <w:spacing w:before="120" w:after="120" w:line="240" w:lineRule="auto"/>
+              <w:ind w:left="0"/>
+              <w:contextualSpacing w:val="0"/>
+              <w:jc w:val="both"/>
+              <w:rPr>
+                <w:rFonts w:ascii="Times New Roman" w:eastAsiaTheme="minorEastAsia" w:hAnsi="Times New Roman" w:cs="Times New Roman"/>
+                <w:sz w:val="24"/>
+                <w:szCs w:val="24"/>
+                <w:lang w:val="en-AU"/>
+              </w:rPr>
+            </w:pPr>
+            <w:r>
+              <w:rPr>
+                <w:rFonts w:ascii="Times New Roman" w:eastAsiaTheme="minorEastAsia" w:hAnsi="Times New Roman" w:cs="Times New Roman"/>
+                <w:sz w:val="24"/>
+                <w:szCs w:val="24"/>
+                <w:lang w:val="en-AU"/>
+              </w:rPr>
+              <w:t xml:space="preserve">Model training and validation; </w:t>
+            </w:r>
+            <w:r>
+              <w:rPr>
+                <w:rFonts w:ascii="Times New Roman" w:eastAsiaTheme="minorEastAsia" w:hAnsi="Times New Roman" w:cs="Times New Roman"/>
+                <w:sz w:val="24"/>
+                <w:szCs w:val="24"/>
+                <w:lang w:val="en-AU"/>
+              </w:rPr>
+              <w:t>visualisation</w:t>
+            </w:r>
+          </w:p>
+        </w:tc>
+        <w:tc>
+          <w:tcPr>
+            <w:tcW w:w="3117" w:type="dxa"/>
+          </w:tcPr>
+          <w:p>
+            <w:pPr>
+              <w:pStyle w:val="ListParagraph"/>
+              <w:spacing w:before="120" w:after="120" w:line="240" w:lineRule="auto"/>
+              <w:ind w:left="0"/>
+              <w:contextualSpacing w:val="0"/>
+              <w:jc w:val="both"/>
+              <w:rPr>
+                <w:rFonts w:ascii="Times New Roman" w:eastAsiaTheme="minorEastAsia" w:hAnsi="Times New Roman" w:cs="Times New Roman"/>
+                <w:sz w:val="24"/>
+                <w:szCs w:val="24"/>
+                <w:lang w:val="en-AU"/>
+              </w:rPr>
+            </w:pPr>
+            <w:r>
+              <w:rPr>
+                <w:rFonts w:ascii="Times New Roman" w:eastAsiaTheme="minorEastAsia" w:hAnsi="Times New Roman" w:cs="Times New Roman"/>
+                <w:sz w:val="24"/>
+                <w:szCs w:val="24"/>
+                <w:lang w:val="en-AU"/>
+              </w:rPr>
+              <w:t xml:space="preserve">Validated candidate model; </w:t>
+            </w:r>
+            <w:r>
+              <w:rPr>
+                <w:rFonts w:ascii="Times New Roman" w:eastAsiaTheme="minorEastAsia" w:hAnsi="Times New Roman" w:cs="Times New Roman"/>
+                <w:sz w:val="24"/>
+                <w:szCs w:val="24"/>
+                <w:lang w:val="en-AU"/>
+              </w:rPr>
+              <w:t>visualisation</w:t>
+            </w:r>
+          </w:p>
+        </w:tc>
+        <w:tc>
+          <w:tcPr>
+            <w:tcW w:w="1643" w:type="dxa"/>
+          </w:tcPr>
+          <w:p>
+            <w:pPr>
+              <w:pStyle w:val="ListParagraph"/>
+              <w:spacing w:before="120" w:after="120" w:line="240" w:lineRule="auto"/>
+              <w:ind w:left="0"/>
+              <w:contextualSpacing w:val="0"/>
+              <w:jc w:val="both"/>
+              <w:rPr>
+                <w:rFonts w:ascii="Times New Roman" w:eastAsiaTheme="minorEastAsia" w:hAnsi="Times New Roman" w:cs="Times New Roman"/>
+                <w:sz w:val="24"/>
+                <w:szCs w:val="24"/>
+                <w:lang w:val="en-AU"/>
+              </w:rPr>
+            </w:pPr>
+            <w:r>
+              <w:rPr>
+                <w:rFonts w:ascii="Times New Roman" w:eastAsiaTheme="minorEastAsia" w:hAnsi="Times New Roman" w:cs="Times New Roman"/>
+                <w:sz w:val="24"/>
+                <w:szCs w:val="24"/>
+                <w:lang w:val="en-AU"/>
+              </w:rPr>
+              <w:t xml:space="preserve"> (Model)</w:t>
+            </w:r>
+          </w:p>
+          <w:p>
+            <w:pPr>
+              <w:pStyle w:val="ListParagraph"/>
+              <w:spacing w:before="120" w:after="120" w:line="240" w:lineRule="auto"/>
+              <w:ind w:left="0"/>
+              <w:contextualSpacing w:val="0"/>
+              <w:jc w:val="both"/>
+              <w:rPr>
+                <w:rFonts w:ascii="Times New Roman" w:eastAsiaTheme="minorEastAsia" w:hAnsi="Times New Roman" w:cs="Times New Roman"/>
+                <w:sz w:val="24"/>
+                <w:szCs w:val="24"/>
+                <w:lang w:val="en-AU"/>
+              </w:rPr>
+            </w:pPr>
+            <w:r>
+              <w:rPr>
+                <w:rFonts w:ascii="Times New Roman" w:eastAsiaTheme="minorEastAsia" w:hAnsi="Times New Roman" w:cs="Times New Roman"/>
+                <w:sz w:val="24"/>
+                <w:szCs w:val="24"/>
+                <w:lang w:val="en-AU"/>
+              </w:rPr>
+              <w:t xml:space="preserve"> (Visualisation)</w:t>
+            </w:r>
+          </w:p>
+        </w:tc>
+      </w:tr>
+      <w:tr>
+        <w:tc>
+          <w:tcPr>
+            <w:tcW w:w="804" w:type="dxa"/>
+            <w:shd w:val="clear" w:color="auto" w:fill="DBE5F1" w:themeFill="accent1" w:themeFillTint="33"/>
+          </w:tcPr>
+          <w:p>
+            <w:pPr>
+              <w:pStyle w:val="ListParagraph"/>
+              <w:spacing w:before="120" w:after="120" w:line="240" w:lineRule="auto"/>
+              <w:ind w:left="0"/>
+              <w:contextualSpacing w:val="0"/>
+              <w:jc w:val="both"/>
+              <w:rPr>
+                <w:rFonts w:ascii="Times New Roman" w:eastAsiaTheme="minorEastAsia" w:hAnsi="Times New Roman" w:cs="Times New Roman"/>
+                <w:b/>
+                <w:bCs/>
+                <w:sz w:val="24"/>
+                <w:szCs w:val="24"/>
+                <w:lang w:val="en-AU"/>
+              </w:rPr>
+            </w:pPr>
+            <w:r>
+              <w:rPr>
+                <w:rFonts w:ascii="Times New Roman" w:eastAsiaTheme="minorEastAsia" w:hAnsi="Times New Roman" w:cs="Times New Roman"/>
+                <w:b/>
+                <w:bCs/>
+                <w:sz w:val="24"/>
+                <w:szCs w:val="24"/>
+                <w:lang w:val="en-AU"/>
+              </w:rPr>
+              <w:t>9</w:t>
+            </w:r>
+          </w:p>
+        </w:tc>
+        <w:tc>
+          <w:tcPr>
+            <w:tcW w:w="3026" w:type="dxa"/>
+            <w:shd w:val="clear" w:color="auto" w:fill="DBE5F1" w:themeFill="accent1" w:themeFillTint="33"/>
+          </w:tcPr>
+          <w:p>
+            <w:pPr>
+              <w:pStyle w:val="ListParagraph"/>
+              <w:spacing w:before="120" w:after="120" w:line="240" w:lineRule="auto"/>
+              <w:ind w:left="0"/>
+              <w:contextualSpacing w:val="0"/>
+              <w:jc w:val="both"/>
+              <w:rPr>
+                <w:rFonts w:ascii="Times New Roman" w:eastAsiaTheme="minorEastAsia" w:hAnsi="Times New Roman" w:cs="Times New Roman"/>
+                <w:b/>
+                <w:bCs/>
+                <w:sz w:val="24"/>
+                <w:szCs w:val="24"/>
+                <w:lang w:val="en-AU"/>
+              </w:rPr>
+            </w:pPr>
+            <w:r>
+              <w:rPr>
+                <w:rFonts w:ascii="Times New Roman" w:eastAsiaTheme="minorEastAsia" w:hAnsi="Times New Roman" w:cs="Times New Roman"/>
+                <w:b/>
+                <w:bCs/>
+                <w:sz w:val="24"/>
+                <w:szCs w:val="24"/>
+                <w:lang w:val="en-AU"/>
+              </w:rPr>
+              <w:t>Rehearse and deliver technical demonstration</w:t>
+            </w:r>
+          </w:p>
+        </w:tc>
+        <w:tc>
+          <w:tcPr>
+            <w:tcW w:w="3117" w:type="dxa"/>
+            <w:shd w:val="clear" w:color="auto" w:fill="DBE5F1" w:themeFill="accent1" w:themeFillTint="33"/>
+          </w:tcPr>
+          <w:p>
+            <w:pPr>
+              <w:pStyle w:val="ListParagraph"/>
+              <w:spacing w:before="120" w:after="120" w:line="240" w:lineRule="auto"/>
+              <w:ind w:left="0"/>
+              <w:contextualSpacing w:val="0"/>
+              <w:jc w:val="both"/>
+              <w:rPr>
+                <w:rFonts w:ascii="Times New Roman" w:eastAsiaTheme="minorEastAsia" w:hAnsi="Times New Roman" w:cs="Times New Roman"/>
+                <w:b/>
+                <w:bCs/>
+                <w:sz w:val="24"/>
+                <w:szCs w:val="24"/>
+                <w:lang w:val="en-AU"/>
+              </w:rPr>
+            </w:pPr>
+            <w:r>
+              <w:rPr>
+                <w:rFonts w:ascii="Times New Roman" w:eastAsiaTheme="minorEastAsia" w:hAnsi="Times New Roman" w:cs="Times New Roman"/>
+                <w:b/>
+                <w:bCs/>
+                <w:sz w:val="24"/>
+                <w:szCs w:val="24"/>
+                <w:lang w:val="en-AU"/>
+              </w:rPr>
+              <w:t>Assessment 3 submitted: Group Te</w:t>
+            </w:r>
+            <w:r>
+              <w:rPr>
+                <w:rFonts w:ascii="Times New Roman" w:eastAsiaTheme="minorEastAsia" w:hAnsi="Times New Roman" w:cs="Times New Roman"/>
+                <w:b/>
+                <w:bCs/>
+                <w:sz w:val="24"/>
+                <w:szCs w:val="24"/>
+                <w:lang w:val="en-AU"/>
+              </w:rPr>
+              <w:t>chnical demonstration and presentation</w:t>
+            </w:r>
+          </w:p>
+        </w:tc>
+        <w:tc>
+          <w:tcPr>
+            <w:tcW w:w="1643" w:type="dxa"/>
+            <w:shd w:val="clear" w:color="auto" w:fill="DBE5F1" w:themeFill="accent1" w:themeFillTint="33"/>
+          </w:tcPr>
+          <w:p>
+            <w:pPr>
+              <w:pStyle w:val="ListParagraph"/>
+              <w:spacing w:before="120" w:after="120" w:line="240" w:lineRule="auto"/>
+              <w:ind w:left="0"/>
+              <w:contextualSpacing w:val="0"/>
+              <w:jc w:val="both"/>
+              <w:rPr>
+                <w:rFonts w:ascii="Times New Roman" w:eastAsiaTheme="minorEastAsia" w:hAnsi="Times New Roman" w:cs="Times New Roman"/>
+                <w:b/>
+                <w:bCs/>
+                <w:sz w:val="24"/>
+                <w:szCs w:val="24"/>
+                <w:lang w:val="en-AU"/>
+              </w:rPr>
+            </w:pPr>
+            <w:r>
+              <w:rPr>
+                <w:rFonts w:ascii="Times New Roman" w:eastAsiaTheme="minorEastAsia" w:hAnsi="Times New Roman" w:cs="Times New Roman"/>
+                <w:b/>
+                <w:bCs/>
+                <w:sz w:val="24"/>
+                <w:szCs w:val="24"/>
+                <w:lang w:val="en-AU"/>
+              </w:rPr>
+              <w:t>All</w:t>
+            </w:r>
+          </w:p>
+        </w:tc>
+      </w:tr>
+      <w:tr>
+        <w:tc>
+          <w:tcPr>
+            <w:tcW w:w="804" w:type="dxa"/>
+          </w:tcPr>
+          <w:p>
+            <w:pPr>
+              <w:pStyle w:val="ListParagraph"/>
+              <w:spacing w:before="120" w:after="120" w:line="240" w:lineRule="auto"/>
+              <w:ind w:left="0"/>
+              <w:contextualSpacing w:val="0"/>
+              <w:jc w:val="both"/>
+              <w:rPr>
+                <w:rFonts w:ascii="Times New Roman" w:eastAsiaTheme="minorEastAsia" w:hAnsi="Times New Roman" w:cs="Times New Roman"/>
+                <w:sz w:val="24"/>
+                <w:szCs w:val="24"/>
+                <w:lang w:val="en-AU"/>
+              </w:rPr>
+            </w:pPr>
+            <w:r>
+              <w:rPr>
+                <w:rFonts w:ascii="Times New Roman" w:eastAsiaTheme="minorEastAsia" w:hAnsi="Times New Roman" w:cs="Times New Roman"/>
+                <w:sz w:val="24"/>
+                <w:szCs w:val="24"/>
+                <w:lang w:val="en-AU"/>
+              </w:rPr>
+              <w:t>10</w:t>
+            </w:r>
+          </w:p>
+        </w:tc>
+        <w:tc>
+          <w:tcPr>
+            <w:tcW w:w="3026" w:type="dxa"/>
+          </w:tcPr>
+          <w:p>
+            <w:pPr>
+              <w:pStyle w:val="ListParagraph"/>
+              <w:spacing w:before="120" w:after="120" w:line="240" w:lineRule="auto"/>
+              <w:ind w:left="0"/>
+              <w:contextualSpacing w:val="0"/>
+              <w:jc w:val="both"/>
+              <w:rPr>
+                <w:rFonts w:ascii="Times New Roman" w:eastAsiaTheme="minorEastAsia" w:hAnsi="Times New Roman" w:cs="Times New Roman"/>
+                <w:sz w:val="24"/>
+                <w:szCs w:val="24"/>
+                <w:lang w:val="en-AU"/>
+              </w:rPr>
+            </w:pPr>
+            <w:r>
+              <w:rPr>
+                <w:rFonts w:ascii="Times New Roman" w:eastAsiaTheme="minorEastAsia" w:hAnsi="Times New Roman" w:cs="Times New Roman"/>
+                <w:sz w:val="24"/>
+                <w:szCs w:val="24"/>
+                <w:lang w:val="en-AU"/>
+              </w:rPr>
+              <w:t>Incorporate feedback; finalise visualisation; implement monitoring and retraining logic</w:t>
+            </w:r>
+          </w:p>
+        </w:tc>
+        <w:tc>
+          <w:tcPr>
+            <w:tcW w:w="3117" w:type="dxa"/>
+          </w:tcPr>
+          <w:p>
+            <w:pPr>
+              <w:pStyle w:val="ListParagraph"/>
+              <w:spacing w:before="120" w:after="120" w:line="240" w:lineRule="auto"/>
+              <w:ind w:left="0"/>
+              <w:contextualSpacing w:val="0"/>
+              <w:jc w:val="both"/>
+              <w:rPr>
+                <w:rFonts w:ascii="Times New Roman" w:eastAsiaTheme="minorEastAsia" w:hAnsi="Times New Roman" w:cs="Times New Roman"/>
+                <w:sz w:val="24"/>
+                <w:szCs w:val="24"/>
+                <w:lang w:val="en-AU"/>
+              </w:rPr>
+            </w:pPr>
+            <w:r>
+              <w:rPr>
+                <w:rFonts w:ascii="Times New Roman" w:eastAsiaTheme="minorEastAsia" w:hAnsi="Times New Roman" w:cs="Times New Roman"/>
+                <w:sz w:val="24"/>
+                <w:szCs w:val="24"/>
+                <w:lang w:val="en-AU"/>
+              </w:rPr>
+              <w:t>Complete visualisation; monitoring stage imple</w:t>
+            </w:r>
+            <w:r>
+              <w:rPr>
+                <w:rFonts w:ascii="Times New Roman" w:eastAsiaTheme="minorEastAsia" w:hAnsi="Times New Roman" w:cs="Times New Roman"/>
+                <w:sz w:val="24"/>
+                <w:szCs w:val="24"/>
+                <w:lang w:val="en-AU"/>
+              </w:rPr>
+              <w:t>mented</w:t>
+            </w:r>
+          </w:p>
+        </w:tc>
+        <w:tc>
+          <w:tcPr>
+            <w:tcW w:w="1643" w:type="dxa"/>
+          </w:tcPr>
+          <w:p>
+            <w:pPr>
+              <w:pStyle w:val="ListParagraph"/>
+              <w:spacing w:before="120" w:after="120" w:line="240" w:lineRule="auto"/>
+              <w:ind w:left="0"/>
+              <w:contextualSpacing w:val="0"/>
+              <w:jc w:val="both"/>
+              <w:rPr>
+                <w:rFonts w:ascii="Times New Roman" w:eastAsiaTheme="minorEastAsia" w:hAnsi="Times New Roman" w:cs="Times New Roman"/>
+                <w:sz w:val="24"/>
+                <w:szCs w:val="24"/>
+                <w:lang w:val="en-AU"/>
+              </w:rPr>
+            </w:pPr>
+            <w:r>
+              <w:rPr>
+                <w:rFonts w:ascii="Times New Roman" w:eastAsiaTheme="minorEastAsia" w:hAnsi="Times New Roman" w:cs="Times New Roman"/>
+                <w:sz w:val="24"/>
+                <w:szCs w:val="24"/>
+                <w:lang w:val="en-AU"/>
+              </w:rPr>
+              <w:t xml:space="preserve"> (Visualisation)</w:t>
+            </w:r>
+          </w:p>
+          <w:p>
+            <w:pPr>
+              <w:pStyle w:val="ListParagraph"/>
+              <w:spacing w:before="120" w:after="120" w:line="240" w:lineRule="auto"/>
+              <w:ind w:left="0"/>
+              <w:contextualSpacing w:val="0"/>
+              <w:jc w:val="both"/>
+              <w:rPr>
+                <w:rFonts w:ascii="Times New Roman" w:eastAsiaTheme="minorEastAsia" w:hAnsi="Times New Roman" w:cs="Times New Roman"/>
+                <w:sz w:val="24"/>
+                <w:szCs w:val="24"/>
+                <w:lang w:val="en-AU"/>
+              </w:rPr>
+            </w:pPr>
+            <w:r>
+              <w:rPr>
+                <w:rFonts w:ascii="Times New Roman" w:eastAsiaTheme="minorEastAsia" w:hAnsi="Times New Roman" w:cs="Times New Roman"/>
+                <w:sz w:val="24"/>
+                <w:szCs w:val="24"/>
+                <w:lang w:val="en-AU"/>
+              </w:rPr>
+              <w:t xml:space="preserve"> (Monitor)</w:t>
+            </w:r>
+          </w:p>
+        </w:tc>
+      </w:tr>
+      <w:tr>
+        <w:tc>
+          <w:tcPr>
+            <w:tcW w:w="804" w:type="dxa"/>
+          </w:tcPr>
+          <w:p>
+            <w:pPr>
+              <w:pStyle w:val="ListParagraph"/>
+              <w:spacing w:before="120" w:after="120" w:line="240" w:lineRule="auto"/>
+              <w:ind w:left="0"/>
+              <w:contextualSpacing w:val="0"/>
+              <w:jc w:val="both"/>
+              <w:rPr>
+                <w:rFonts w:ascii="Times New Roman" w:eastAsiaTheme="minorEastAsia" w:hAnsi="Times New Roman" w:cs="Times New Roman"/>
+                <w:sz w:val="24"/>
+                <w:szCs w:val="24"/>
+                <w:lang w:val="en-AU"/>
+              </w:rPr>
+            </w:pPr>
+            <w:r>
+              <w:rPr>
+                <w:rFonts w:ascii="Times New Roman" w:eastAsiaTheme="minorEastAsia" w:hAnsi="Times New Roman" w:cs="Times New Roman"/>
+                <w:sz w:val="24"/>
+                <w:szCs w:val="24"/>
+                <w:lang w:val="en-AU"/>
+              </w:rPr>
+              <w:t>11</w:t>
+            </w:r>
+          </w:p>
+        </w:tc>
+        <w:tc>
+          <w:tcPr>
+            <w:tcW w:w="3026" w:type="dxa"/>
+          </w:tcPr>
+          <w:p>
+            <w:pPr>
+              <w:pStyle w:val="ListParagraph"/>
+              <w:spacing w:before="120" w:after="120" w:line="240" w:lineRule="auto"/>
+              <w:ind w:left="0"/>
+              <w:contextualSpacing w:val="0"/>
+              <w:jc w:val="both"/>
+              <w:rPr>
+                <w:rFonts w:ascii="Times New Roman" w:eastAsiaTheme="minorEastAsia" w:hAnsi="Times New Roman" w:cs="Times New Roman"/>
+                <w:sz w:val="24"/>
+                <w:szCs w:val="24"/>
+                <w:lang w:val="en-AU"/>
+              </w:rPr>
+            </w:pPr>
+            <w:r>
+              <w:rPr>
+                <w:rFonts w:ascii="Times New Roman" w:eastAsiaTheme="minorEastAsia" w:hAnsi="Times New Roman" w:cs="Times New Roman"/>
+                <w:sz w:val="24"/>
+                <w:szCs w:val="24"/>
+                <w:lang w:val="en-AU"/>
+              </w:rPr>
+              <w:t>End-to-end pipeline testing; draft final report sections</w:t>
+            </w:r>
+          </w:p>
+        </w:tc>
+        <w:tc>
+          <w:tcPr>
+            <w:tcW w:w="3117" w:type="dxa"/>
+          </w:tcPr>
+          <w:p>
+            <w:pPr>
+              <w:pStyle w:val="ListParagraph"/>
+              <w:spacing w:before="120" w:after="120" w:line="240" w:lineRule="auto"/>
+              <w:ind w:left="0"/>
+              <w:contextualSpacing w:val="0"/>
+              <w:jc w:val="both"/>
+              <w:rPr>
+                <w:rFonts w:ascii="Times New Roman" w:eastAsiaTheme="minorEastAsia" w:hAnsi="Times New Roman" w:cs="Times New Roman"/>
+                <w:sz w:val="24"/>
+                <w:szCs w:val="24"/>
+                <w:lang w:val="en-AU"/>
+              </w:rPr>
+            </w:pPr>
+            <w:r>
+              <w:rPr>
+                <w:rFonts w:ascii="Times New Roman" w:eastAsiaTheme="minorEastAsia" w:hAnsi="Times New Roman" w:cs="Times New Roman"/>
+                <w:sz w:val="24"/>
+                <w:szCs w:val="24"/>
+                <w:lang w:val="en-AU"/>
+              </w:rPr>
+              <w:t>Full pipeline validated; report draft</w:t>
+            </w:r>
+          </w:p>
+        </w:tc>
+        <w:tc>
+          <w:tcPr>
+            <w:tcW w:w="1643" w:type="dxa"/>
+          </w:tcPr>
+          <w:p>
+            <w:pPr>
+              <w:pStyle w:val="ListParagraph"/>
+              <w:spacing w:before="120" w:after="120" w:line="240" w:lineRule="auto"/>
+              <w:ind w:left="0"/>
+              <w:contextualSpacing w:val="0"/>
+              <w:jc w:val="both"/>
+              <w:rPr>
+                <w:rFonts w:ascii="Times New Roman" w:eastAsiaTheme="minorEastAsia" w:hAnsi="Times New Roman" w:cs="Times New Roman"/>
+                <w:sz w:val="24"/>
+                <w:szCs w:val="24"/>
+                <w:lang w:val="en-AU"/>
+              </w:rPr>
+            </w:pPr>
+            <w:r>
+              <w:rPr>
+                <w:rFonts w:ascii="Times New Roman" w:eastAsiaTheme="minorEastAsia" w:hAnsi="Times New Roman" w:cs="Times New Roman"/>
+                <w:sz w:val="24"/>
+                <w:szCs w:val="24"/>
+                <w:lang w:val="en-AU"/>
+              </w:rPr>
+              <w:t>All</w:t>
+            </w:r>
+          </w:p>
+        </w:tc>
+      </w:tr>
+      <w:tr>
+        <w:tc>
+          <w:tcPr>
+            <w:tcW w:w="804" w:type="dxa"/>
+            <w:shd w:val="clear" w:color="auto" w:fill="DBE5F1" w:themeFill="accent1" w:themeFillTint="33"/>
+          </w:tcPr>
+          <w:p>
+            <w:pPr>
+              <w:pStyle w:val="ListParagraph"/>
+              <w:spacing w:before="120" w:after="120" w:line="240" w:lineRule="auto"/>
+              <w:ind w:left="0"/>
+              <w:contextualSpacing w:val="0"/>
+              <w:jc w:val="both"/>
+              <w:rPr>
+                <w:rFonts w:ascii="Times New Roman" w:eastAsiaTheme="minorEastAsia" w:hAnsi="Times New Roman" w:cs="Times New Roman"/>
+                <w:b/>
+                <w:bCs/>
+                <w:sz w:val="24"/>
+                <w:szCs w:val="24"/>
+                <w:lang w:val="en-AU"/>
+              </w:rPr>
+            </w:pPr>
+            <w:r>
+              <w:rPr>
+                <w:rFonts w:ascii="Times New Roman" w:eastAsiaTheme="minorEastAsia" w:hAnsi="Times New Roman" w:cs="Times New Roman"/>
+                <w:b/>
+                <w:bCs/>
+                <w:sz w:val="24"/>
+                <w:szCs w:val="24"/>
+                <w:lang w:val="en-AU"/>
+              </w:rPr>
+              <w:t>12</w:t>
+            </w:r>
+          </w:p>
+        </w:tc>
+        <w:tc>
+          <w:tcPr>
+            <w:tcW w:w="3026" w:type="dxa"/>
+            <w:shd w:val="clear" w:color="auto" w:fill="DBE5F1" w:themeFill="accent1" w:themeFillTint="33"/>
+          </w:tcPr>
+          <w:p>
+            <w:pPr>
+              <w:pStyle w:val="ListParagraph"/>
+              <w:spacing w:before="120" w:after="120" w:line="240" w:lineRule="auto"/>
+              <w:ind w:left="0"/>
+              <w:contextualSpacing w:val="0"/>
+              <w:jc w:val="both"/>
+              <w:rPr>
+                <w:rFonts w:ascii="Times New Roman" w:eastAsiaTheme="minorEastAsia" w:hAnsi="Times New Roman" w:cs="Times New Roman"/>
+                <w:b/>
+                <w:bCs/>
+                <w:sz w:val="24"/>
+                <w:szCs w:val="24"/>
+                <w:lang w:val="en-AU"/>
+              </w:rPr>
+            </w:pPr>
+            <w:r>
+              <w:rPr>
+                <w:rFonts w:ascii="Times New Roman" w:eastAsiaTheme="minorEastAsia" w:hAnsi="Times New Roman" w:cs="Times New Roman"/>
+                <w:b/>
+                <w:bCs/>
+                <w:sz w:val="24"/>
+                <w:szCs w:val="24"/>
+                <w:lang w:val="en-AU"/>
+              </w:rPr>
+              <w:t>Final review and submission</w:t>
+            </w:r>
+          </w:p>
+        </w:tc>
+        <w:tc>
+          <w:tcPr>
+            <w:tcW w:w="3117" w:type="dxa"/>
+            <w:shd w:val="clear" w:color="auto" w:fill="DBE5F1" w:themeFill="accent1" w:themeFillTint="33"/>
+          </w:tcPr>
+          <w:p>
+            <w:pPr>
+              <w:pStyle w:val="ListParagraph"/>
+              <w:spacing w:before="120" w:after="120" w:line="240" w:lineRule="auto"/>
+              <w:ind w:left="0"/>
+              <w:contextualSpacing w:val="0"/>
+              <w:jc w:val="both"/>
+              <w:rPr>
+                <w:rFonts w:ascii="Times New Roman" w:eastAsiaTheme="minorEastAsia" w:hAnsi="Times New Roman" w:cs="Times New Roman"/>
+                <w:b/>
+                <w:bCs/>
+                <w:sz w:val="24"/>
+                <w:szCs w:val="24"/>
+                <w:lang w:val="en-AU"/>
+              </w:rPr>
+            </w:pPr>
+            <w:r>
+              <w:rPr>
+                <w:rFonts w:ascii="Times New Roman" w:eastAsiaTheme="minorEastAsia" w:hAnsi="Times New Roman" w:cs="Times New Roman"/>
+                <w:b/>
+                <w:bCs/>
+                <w:sz w:val="24"/>
+                <w:szCs w:val="24"/>
+                <w:lang w:val="en-AU"/>
+              </w:rPr>
+              <w:t>Assessment 4 submitted: Final Professional Report</w:t>
+            </w:r>
+          </w:p>
+        </w:tc>
+        <w:tc>
+          <w:tcPr>
+            <w:tcW w:w="1643" w:type="dxa"/>
+            <w:shd w:val="clear" w:color="auto" w:fill="DBE5F1" w:themeFill="accent1" w:themeFillTint="33"/>
+          </w:tcPr>
+          <w:p>
+            <w:pPr>
+              <w:pStyle w:val="ListParagraph"/>
+              <w:spacing w:before="120" w:after="120" w:line="240" w:lineRule="auto"/>
+              <w:ind w:left="0"/>
+              <w:contextualSpacing w:val="0"/>
+              <w:jc w:val="both"/>
+              <w:rPr>
+                <w:rFonts w:ascii="Times New Roman" w:eastAsiaTheme="minorEastAsia" w:hAnsi="Times New Roman" w:cs="Times New Roman"/>
+                <w:b/>
+                <w:bCs/>
+                <w:sz w:val="24"/>
+                <w:szCs w:val="24"/>
+                <w:lang w:val="en-AU"/>
+              </w:rPr>
+            </w:pPr>
+            <w:r>
+              <w:rPr>
+                <w:rFonts w:ascii="Times New Roman" w:eastAsiaTheme="minorEastAsia" w:hAnsi="Times New Roman" w:cs="Times New Roman"/>
+                <w:b/>
+                <w:bCs/>
+                <w:sz w:val="24"/>
+                <w:szCs w:val="24"/>
+                <w:lang w:val="en-AU"/>
+              </w:rPr>
+              <w:t>All</w:t>
+            </w:r>
+          </w:p>
+        </w:tc>
+      </w:tr>
+    </w:tbl>
+    <w:p>
+      <w:pPr>
+        <w:pStyle w:val="Caption"/>
+        <w:jc w:val="center"/>
+        <w:rPr>
+          <w:color w:val="auto"/>
+        </w:rPr>
+      </w:pPr>
     </w:p>
     <w:p>
       <w:pPr>
@@ -1357,85 +3400,583 @@
     <w:p>
       <w:pPr>
         <w:pStyle w:val="ListParagraph"/>
-        <w:ind w:left="360"/>
-        <w:rPr>
-          <w:rFonts w:ascii="Times New Roman" w:eastAsia="Times New Roman" w:hAnsi="Times New Roman"/>
-          <w:sz w:val="24"/>
-          <w:lang w:eastAsia="en-AU"/>
-        </w:rPr>
-      </w:pPr>
-      <w:proofErr w:type="gramStart"/>
-      <w:r>
-        <w:rPr>
-          <w:rFonts w:ascii="Times New Roman" w:eastAsia="Times New Roman" w:hAnsi="Symbol"/>
-          <w:sz w:val="24"/>
-          <w:lang w:eastAsia="en-AU"/>
-        </w:rPr>
-        <w:t></w:t>
-      </w:r>
-      <w:r>
-        <w:rPr>
-          <w:rFonts w:ascii="Times New Roman" w:eastAsia="Times New Roman" w:hAnsi="Times New Roman"/>
-          <w:sz w:val="24"/>
-          <w:lang w:eastAsia="en-AU"/>
-        </w:rPr>
-        <w:t xml:space="preserve">  Table</w:t>
-      </w:r>
-      <w:proofErr w:type="gramEnd"/>
-      <w:r>
-        <w:rPr>
-          <w:rFonts w:ascii="Times New Roman" w:eastAsia="Times New Roman" w:hAnsi="Times New Roman"/>
-          <w:sz w:val="24"/>
-          <w:lang w:eastAsia="en-AU"/>
-        </w:rPr>
-        <w:t xml:space="preserve"> mapping member → architecture stage(s) → responsibilities  </w:t>
-      </w:r>
-    </w:p>
-    <w:p>
-      <w:pPr>
-        <w:pStyle w:val="ListParagraph"/>
         <w:spacing w:before="120" w:after="120" w:line="240" w:lineRule="auto"/>
-        <w:ind w:left="360"/>
+        <w:ind w:left="426"/>
         <w:contextualSpacing w:val="0"/>
         <w:jc w:val="both"/>
         <w:rPr>
           <w:rFonts w:ascii="Times New Roman" w:eastAsiaTheme="minorEastAsia" w:hAnsi="Times New Roman" w:cs="Times New Roman"/>
-          <w:b/>
-          <w:bCs/>
           <w:sz w:val="24"/>
           <w:szCs w:val="24"/>
-          <w:lang w:val="vi-VN"/>
+          <w:lang w:val="en-AU"/>
         </w:rPr>
       </w:pPr>
-      <w:proofErr w:type="gramStart"/>
       <w:r>
         <w:rPr>
-          <w:rFonts w:ascii="Times New Roman" w:eastAsia="Times New Roman" w:hAnsi="Symbol" w:cs="Times New Roman"/>
+          <w:rFonts w:ascii="Times New Roman" w:eastAsiaTheme="minorEastAsia" w:hAnsi="Times New Roman" w:cs="Times New Roman"/>
           <w:sz w:val="24"/>
           <w:szCs w:val="24"/>
-          <w:lang w:val="en-AU" w:eastAsia="en-AU"/>
+          <w:lang w:val="en-AU"/>
         </w:rPr>
-        <w:t></w:t>
+        <w:t>Each team member owns one or two stages of the architecture for the duration of the semester</w:t>
       </w:r>
       <w:r>
         <w:rPr>
-          <w:rFonts w:ascii="Times New Roman" w:eastAsia="Times New Roman" w:hAnsi="Times New Roman" w:cs="Times New Roman"/>
+          <w:rFonts w:ascii="Times New Roman" w:eastAsiaTheme="minorEastAsia" w:hAnsi="Times New Roman" w:cs="Times New Roman"/>
           <w:sz w:val="24"/>
           <w:szCs w:val="24"/>
-          <w:lang w:val="en-AU" w:eastAsia="en-AU"/>
+          <w:lang w:val="en-AU"/>
         </w:rPr>
-        <w:t xml:space="preserve">  One</w:t>
+        <w:t xml:space="preserve"> (Table 2), ensuring individually attributable contributions are visible in the GitHub commit history across all four assessments.</w:t>
       </w:r>
-      <w:proofErr w:type="gramEnd"/>
+    </w:p>
+    <w:p>
+      <w:pPr>
+        <w:pStyle w:val="Caption"/>
+        <w:keepNext/>
+        <w:jc w:val="center"/>
+        <w:rPr>
+          <w:rFonts w:ascii="Times New Roman" w:hAnsi="Times New Roman"/>
+          <w:color w:val="auto"/>
+          <w:sz w:val="24"/>
+          <w:szCs w:val="24"/>
+        </w:rPr>
+      </w:pPr>
       <w:r>
         <w:rPr>
-          <w:rFonts w:ascii="Times New Roman" w:eastAsia="Times New Roman" w:hAnsi="Times New Roman" w:cs="Times New Roman"/>
+          <w:rFonts w:ascii="Times New Roman" w:hAnsi="Times New Roman"/>
+          <w:color w:val="auto"/>
           <w:sz w:val="24"/>
           <w:szCs w:val="24"/>
-          <w:lang w:val="en-AU" w:eastAsia="en-AU"/>
         </w:rPr>
-        <w:t xml:space="preserve"> line on how ownership continues across the whole semester</w:t>
+        <w:t xml:space="preserve">Table </w:t>
       </w:r>
+      <w:r>
+        <w:rPr>
+          <w:rFonts w:ascii="Times New Roman" w:hAnsi="Times New Roman"/>
+          <w:color w:val="auto"/>
+          <w:sz w:val="24"/>
+          <w:szCs w:val="24"/>
+        </w:rPr>
+        <w:fldChar w:fldCharType="begin"/>
+      </w:r>
+      <w:r>
+        <w:rPr>
+          <w:rFonts w:ascii="Times New Roman" w:hAnsi="Times New Roman"/>
+          <w:color w:val="auto"/>
+          <w:sz w:val="24"/>
+          <w:szCs w:val="24"/>
+        </w:rPr>
+        <w:instrText xml:space="preserve"> SEQ Table \* ROMAN </w:instrText>
+      </w:r>
+      <w:r>
+        <w:rPr>
+          <w:rFonts w:ascii="Times New Roman" w:hAnsi="Times New Roman"/>
+          <w:color w:val="auto"/>
+          <w:sz w:val="24"/>
+          <w:szCs w:val="24"/>
+        </w:rPr>
+        <w:fldChar w:fldCharType="separate"/>
+      </w:r>
+      <w:r>
+        <w:rPr>
+          <w:rFonts w:ascii="Times New Roman" w:hAnsi="Times New Roman"/>
+          <w:noProof/>
+          <w:color w:val="auto"/>
+          <w:sz w:val="24"/>
+          <w:szCs w:val="24"/>
+        </w:rPr>
+        <w:t>II</w:t>
+      </w:r>
+      <w:r>
+        <w:rPr>
+          <w:rFonts w:ascii="Times New Roman" w:hAnsi="Times New Roman"/>
+          <w:color w:val="auto"/>
+          <w:sz w:val="24"/>
+          <w:szCs w:val="24"/>
+        </w:rPr>
+        <w:fldChar w:fldCharType="end"/>
+      </w:r>
+      <w:r>
+        <w:rPr>
+          <w:rFonts w:ascii="Times New Roman" w:hAnsi="Times New Roman"/>
+          <w:color w:val="auto"/>
+          <w:sz w:val="24"/>
+          <w:szCs w:val="24"/>
+        </w:rPr>
+        <w:t>. Task allocation and team structure</w:t>
+      </w:r>
+    </w:p>
+    <w:tbl>
+      <w:tblPr>
+        <w:tblStyle w:val="TableGrid"/>
+        <w:tblW w:w="0" w:type="auto"/>
+        <w:tblInd w:w="426" w:type="dxa"/>
+        <w:tblLook w:val="04A0" w:firstRow="1" w:lastRow="0" w:firstColumn="1" w:lastColumn="0" w:noHBand="0" w:noVBand="1"/>
+      </w:tblPr>
+      <w:tblGrid>
+        <w:gridCol w:w="2829"/>
+        <w:gridCol w:w="1843"/>
+        <w:gridCol w:w="3918"/>
+      </w:tblGrid>
+      <w:tr>
+        <w:tc>
+          <w:tcPr>
+            <w:tcW w:w="2829" w:type="dxa"/>
+            <w:shd w:val="clear" w:color="auto" w:fill="DBE5F1" w:themeFill="accent1" w:themeFillTint="33"/>
+          </w:tcPr>
+          <w:p>
+            <w:pPr>
+              <w:pStyle w:val="ListParagraph"/>
+              <w:spacing w:before="120" w:after="120" w:line="240" w:lineRule="auto"/>
+              <w:ind w:left="0"/>
+              <w:contextualSpacing w:val="0"/>
+              <w:jc w:val="center"/>
+              <w:rPr>
+                <w:rFonts w:ascii="Times New Roman" w:eastAsiaTheme="minorEastAsia" w:hAnsi="Times New Roman" w:cs="Times New Roman"/>
+                <w:b/>
+                <w:bCs/>
+                <w:sz w:val="24"/>
+                <w:szCs w:val="24"/>
+                <w:lang w:val="en-AU"/>
+              </w:rPr>
+            </w:pPr>
+            <w:r>
+              <w:rPr>
+                <w:rFonts w:ascii="Times New Roman" w:eastAsiaTheme="minorEastAsia" w:hAnsi="Times New Roman" w:cs="Times New Roman"/>
+                <w:b/>
+                <w:bCs/>
+                <w:sz w:val="24"/>
+                <w:szCs w:val="24"/>
+                <w:lang w:val="en-AU"/>
+              </w:rPr>
+              <w:t>Member</w:t>
+            </w:r>
+          </w:p>
+        </w:tc>
+        <w:tc>
+          <w:tcPr>
+            <w:tcW w:w="1843" w:type="dxa"/>
+            <w:shd w:val="clear" w:color="auto" w:fill="DBE5F1" w:themeFill="accent1" w:themeFillTint="33"/>
+          </w:tcPr>
+          <w:p>
+            <w:pPr>
+              <w:pStyle w:val="ListParagraph"/>
+              <w:spacing w:before="120" w:after="120" w:line="240" w:lineRule="auto"/>
+              <w:ind w:left="0"/>
+              <w:contextualSpacing w:val="0"/>
+              <w:jc w:val="center"/>
+              <w:rPr>
+                <w:rFonts w:ascii="Times New Roman" w:eastAsiaTheme="minorEastAsia" w:hAnsi="Times New Roman" w:cs="Times New Roman"/>
+                <w:b/>
+                <w:bCs/>
+                <w:sz w:val="24"/>
+                <w:szCs w:val="24"/>
+                <w:lang w:val="en-AU"/>
+              </w:rPr>
+            </w:pPr>
+            <w:r>
+              <w:rPr>
+                <w:rFonts w:ascii="Times New Roman" w:eastAsiaTheme="minorEastAsia" w:hAnsi="Times New Roman" w:cs="Times New Roman"/>
+                <w:b/>
+                <w:bCs/>
+                <w:sz w:val="24"/>
+                <w:szCs w:val="24"/>
+                <w:lang w:val="en-AU"/>
+              </w:rPr>
+              <w:t>Primary role</w:t>
+            </w:r>
+          </w:p>
+        </w:tc>
+        <w:tc>
+          <w:tcPr>
+            <w:tcW w:w="3918" w:type="dxa"/>
+            <w:shd w:val="clear" w:color="auto" w:fill="DBE5F1" w:themeFill="accent1" w:themeFillTint="33"/>
+          </w:tcPr>
+          <w:p>
+            <w:pPr>
+              <w:pStyle w:val="ListParagraph"/>
+              <w:spacing w:before="120" w:after="120" w:line="240" w:lineRule="auto"/>
+              <w:ind w:left="0"/>
+              <w:contextualSpacing w:val="0"/>
+              <w:jc w:val="center"/>
+              <w:rPr>
+                <w:rFonts w:ascii="Times New Roman" w:eastAsiaTheme="minorEastAsia" w:hAnsi="Times New Roman" w:cs="Times New Roman"/>
+                <w:b/>
+                <w:bCs/>
+                <w:sz w:val="24"/>
+                <w:szCs w:val="24"/>
+                <w:lang w:val="en-AU"/>
+              </w:rPr>
+            </w:pPr>
+            <w:r>
+              <w:rPr>
+                <w:rFonts w:ascii="Times New Roman" w:eastAsiaTheme="minorEastAsia" w:hAnsi="Times New Roman" w:cs="Times New Roman"/>
+                <w:b/>
+                <w:bCs/>
+                <w:sz w:val="24"/>
+                <w:szCs w:val="24"/>
+                <w:lang w:val="en-AU"/>
+              </w:rPr>
+              <w:t>Responsibilities</w:t>
+            </w:r>
+          </w:p>
+        </w:tc>
+      </w:tr>
+      <w:tr>
+        <w:tc>
+          <w:tcPr>
+            <w:tcW w:w="2829" w:type="dxa"/>
+          </w:tcPr>
+          <w:p>
+            <w:pPr>
+              <w:pStyle w:val="ListParagraph"/>
+              <w:spacing w:before="120" w:after="120" w:line="240" w:lineRule="auto"/>
+              <w:ind w:left="0"/>
+              <w:contextualSpacing w:val="0"/>
+              <w:jc w:val="both"/>
+              <w:rPr>
+                <w:rFonts w:ascii="Times New Roman" w:eastAsiaTheme="minorEastAsia" w:hAnsi="Times New Roman" w:cs="Times New Roman"/>
+                <w:sz w:val="24"/>
+                <w:szCs w:val="24"/>
+                <w:lang w:val="en-AU"/>
+              </w:rPr>
+            </w:pPr>
+          </w:p>
+        </w:tc>
+        <w:tc>
+          <w:tcPr>
+            <w:tcW w:w="1843" w:type="dxa"/>
+          </w:tcPr>
+          <w:p>
+            <w:pPr>
+              <w:pStyle w:val="ListParagraph"/>
+              <w:spacing w:before="120" w:after="120" w:line="240" w:lineRule="auto"/>
+              <w:ind w:left="0"/>
+              <w:contextualSpacing w:val="0"/>
+              <w:jc w:val="both"/>
+              <w:rPr>
+                <w:rFonts w:ascii="Times New Roman" w:eastAsiaTheme="minorEastAsia" w:hAnsi="Times New Roman" w:cs="Times New Roman"/>
+                <w:sz w:val="24"/>
+                <w:szCs w:val="24"/>
+                <w:lang w:val="en-AU"/>
+              </w:rPr>
+            </w:pPr>
+            <w:r>
+              <w:rPr>
+                <w:rFonts w:ascii="Times New Roman" w:eastAsiaTheme="minorEastAsia" w:hAnsi="Times New Roman" w:cs="Times New Roman"/>
+                <w:sz w:val="24"/>
+                <w:szCs w:val="24"/>
+                <w:lang w:val="en-AU"/>
+              </w:rPr>
+              <w:t>Ingest &amp; Visualisation</w:t>
+            </w:r>
+          </w:p>
+        </w:tc>
+        <w:tc>
+          <w:tcPr>
+            <w:tcW w:w="3918" w:type="dxa"/>
+          </w:tcPr>
+          <w:p>
+            <w:pPr>
+              <w:pStyle w:val="ListParagraph"/>
+              <w:spacing w:before="120" w:after="120" w:line="240" w:lineRule="auto"/>
+              <w:ind w:left="0"/>
+              <w:contextualSpacing w:val="0"/>
+              <w:jc w:val="both"/>
+              <w:rPr>
+                <w:rFonts w:ascii="Times New Roman" w:eastAsiaTheme="minorEastAsia" w:hAnsi="Times New Roman" w:cs="Times New Roman"/>
+                <w:sz w:val="24"/>
+                <w:szCs w:val="24"/>
+                <w:lang w:val="en-AU"/>
+              </w:rPr>
+            </w:pPr>
+            <w:r>
+              <w:rPr>
+                <w:rFonts w:ascii="Times New Roman" w:eastAsiaTheme="minorEastAsia" w:hAnsi="Times New Roman" w:cs="Times New Roman"/>
+                <w:sz w:val="24"/>
+                <w:szCs w:val="24"/>
+                <w:lang w:val="en-AU"/>
+              </w:rPr>
+              <w:t>Builds the data ingestion pipeline into cloud storage; develops the operational dashboard for PFES end users.</w:t>
+            </w:r>
+          </w:p>
+        </w:tc>
+      </w:tr>
+      <w:tr>
+        <w:tc>
+          <w:tcPr>
+            <w:tcW w:w="2829" w:type="dxa"/>
+          </w:tcPr>
+          <w:p>
+            <w:pPr>
+              <w:pStyle w:val="ListParagraph"/>
+              <w:spacing w:before="120" w:after="120" w:line="240" w:lineRule="auto"/>
+              <w:ind w:left="0"/>
+              <w:contextualSpacing w:val="0"/>
+              <w:jc w:val="both"/>
+              <w:rPr>
+                <w:rFonts w:ascii="Times New Roman" w:eastAsiaTheme="minorEastAsia" w:hAnsi="Times New Roman" w:cs="Times New Roman"/>
+                <w:sz w:val="24"/>
+                <w:szCs w:val="24"/>
+                <w:lang w:val="en-AU"/>
+              </w:rPr>
+            </w:pPr>
+          </w:p>
+        </w:tc>
+        <w:tc>
+          <w:tcPr>
+            <w:tcW w:w="1843" w:type="dxa"/>
+          </w:tcPr>
+          <w:p>
+            <w:pPr>
+              <w:pStyle w:val="ListParagraph"/>
+              <w:spacing w:before="120" w:after="120" w:line="240" w:lineRule="auto"/>
+              <w:ind w:left="0"/>
+              <w:contextualSpacing w:val="0"/>
+              <w:jc w:val="both"/>
+              <w:rPr>
+                <w:rFonts w:ascii="Times New Roman" w:eastAsiaTheme="minorEastAsia" w:hAnsi="Times New Roman" w:cs="Times New Roman"/>
+                <w:sz w:val="24"/>
+                <w:szCs w:val="24"/>
+                <w:lang w:val="en-AU"/>
+              </w:rPr>
+            </w:pPr>
+            <w:r>
+              <w:rPr>
+                <w:rFonts w:ascii="Times New Roman" w:eastAsiaTheme="minorEastAsia" w:hAnsi="Times New Roman" w:cs="Times New Roman"/>
+                <w:sz w:val="24"/>
+                <w:szCs w:val="24"/>
+                <w:lang w:val="en-AU"/>
+              </w:rPr>
+              <w:t>Store &amp; Monitor</w:t>
+            </w:r>
+          </w:p>
+        </w:tc>
+        <w:tc>
+          <w:tcPr>
+            <w:tcW w:w="3918" w:type="dxa"/>
+          </w:tcPr>
+          <w:p>
+            <w:pPr>
+              <w:pStyle w:val="ListParagraph"/>
+              <w:spacing w:before="120" w:after="120" w:line="240" w:lineRule="auto"/>
+              <w:ind w:left="0"/>
+              <w:contextualSpacing w:val="0"/>
+              <w:jc w:val="both"/>
+              <w:rPr>
+                <w:rFonts w:ascii="Times New Roman" w:eastAsiaTheme="minorEastAsia" w:hAnsi="Times New Roman" w:cs="Times New Roman"/>
+                <w:sz w:val="24"/>
+                <w:szCs w:val="24"/>
+                <w:lang w:val="en-AU"/>
+              </w:rPr>
+            </w:pPr>
+            <w:r>
+              <w:rPr>
+                <w:rFonts w:ascii="Times New Roman" w:eastAsiaTheme="minorEastAsia" w:hAnsi="Times New Roman" w:cs="Times New Roman"/>
+                <w:sz w:val="24"/>
+                <w:szCs w:val="24"/>
+                <w:lang w:val="en-AU"/>
+              </w:rPr>
+              <w:t>Designs the partition</w:t>
+            </w:r>
+            <w:r>
+              <w:rPr>
+                <w:rFonts w:ascii="Times New Roman" w:eastAsiaTheme="minorEastAsia" w:hAnsi="Times New Roman" w:cs="Times New Roman"/>
+                <w:sz w:val="24"/>
+                <w:szCs w:val="24"/>
+                <w:lang w:val="en-AU"/>
+              </w:rPr>
+              <w:t>ed data lake structure; implements post-</w:t>
+            </w:r>
+            <w:r>
+              <w:rPr>
+                <w:rFonts w:ascii="Times New Roman" w:eastAsiaTheme="minorEastAsia" w:hAnsi="Times New Roman" w:cs="Times New Roman"/>
+                <w:sz w:val="24"/>
+                <w:szCs w:val="24"/>
+                <w:lang w:val="en-AU"/>
+              </w:rPr>
+              <w:lastRenderedPageBreak/>
+              <w:t>deployment monitoring and retraining triggers.</w:t>
+            </w:r>
+          </w:p>
+        </w:tc>
+      </w:tr>
+      <w:tr>
+        <w:tc>
+          <w:tcPr>
+            <w:tcW w:w="2829" w:type="dxa"/>
+          </w:tcPr>
+          <w:p>
+            <w:pPr>
+              <w:pStyle w:val="ListParagraph"/>
+              <w:spacing w:before="120" w:after="120" w:line="240" w:lineRule="auto"/>
+              <w:ind w:left="0"/>
+              <w:contextualSpacing w:val="0"/>
+              <w:jc w:val="both"/>
+              <w:rPr>
+                <w:rFonts w:ascii="Times New Roman" w:eastAsiaTheme="minorEastAsia" w:hAnsi="Times New Roman" w:cs="Times New Roman"/>
+                <w:sz w:val="24"/>
+                <w:szCs w:val="24"/>
+                <w:lang w:val="en-AU"/>
+              </w:rPr>
+            </w:pPr>
+          </w:p>
+        </w:tc>
+        <w:tc>
+          <w:tcPr>
+            <w:tcW w:w="1843" w:type="dxa"/>
+          </w:tcPr>
+          <w:p>
+            <w:pPr>
+              <w:pStyle w:val="ListParagraph"/>
+              <w:spacing w:before="120" w:after="120" w:line="240" w:lineRule="auto"/>
+              <w:ind w:left="0"/>
+              <w:contextualSpacing w:val="0"/>
+              <w:jc w:val="both"/>
+              <w:rPr>
+                <w:rFonts w:ascii="Times New Roman" w:eastAsiaTheme="minorEastAsia" w:hAnsi="Times New Roman" w:cs="Times New Roman"/>
+                <w:sz w:val="24"/>
+                <w:szCs w:val="24"/>
+                <w:lang w:val="en-AU"/>
+              </w:rPr>
+            </w:pPr>
+            <w:r>
+              <w:rPr>
+                <w:rFonts w:ascii="Times New Roman" w:eastAsiaTheme="minorEastAsia" w:hAnsi="Times New Roman" w:cs="Times New Roman"/>
+                <w:sz w:val="24"/>
+                <w:szCs w:val="24"/>
+                <w:lang w:val="en-AU"/>
+              </w:rPr>
+              <w:t>Query</w:t>
+            </w:r>
+          </w:p>
+        </w:tc>
+        <w:tc>
+          <w:tcPr>
+            <w:tcW w:w="3918" w:type="dxa"/>
+          </w:tcPr>
+          <w:p>
+            <w:pPr>
+              <w:pStyle w:val="ListParagraph"/>
+              <w:spacing w:before="120" w:after="120" w:line="240" w:lineRule="auto"/>
+              <w:ind w:left="0"/>
+              <w:contextualSpacing w:val="0"/>
+              <w:jc w:val="both"/>
+              <w:rPr>
+                <w:rFonts w:ascii="Times New Roman" w:eastAsiaTheme="minorEastAsia" w:hAnsi="Times New Roman" w:cs="Times New Roman"/>
+                <w:sz w:val="24"/>
+                <w:szCs w:val="24"/>
+                <w:lang w:val="en-AU"/>
+              </w:rPr>
+            </w:pPr>
+            <w:r>
+              <w:rPr>
+                <w:rFonts w:ascii="Times New Roman" w:eastAsiaTheme="minorEastAsia" w:hAnsi="Times New Roman" w:cs="Times New Roman"/>
+                <w:sz w:val="24"/>
+                <w:szCs w:val="24"/>
+                <w:lang w:val="en-AU"/>
+              </w:rPr>
+              <w:t>Configures the data catalogue and SQL query layer used for analysis and reporting.</w:t>
+            </w:r>
+          </w:p>
+        </w:tc>
+      </w:tr>
+      <w:tr>
+        <w:tc>
+          <w:tcPr>
+            <w:tcW w:w="2829" w:type="dxa"/>
+          </w:tcPr>
+          <w:p>
+            <w:pPr>
+              <w:pStyle w:val="ListParagraph"/>
+              <w:spacing w:before="120" w:after="120" w:line="240" w:lineRule="auto"/>
+              <w:ind w:left="0"/>
+              <w:contextualSpacing w:val="0"/>
+              <w:jc w:val="both"/>
+              <w:rPr>
+                <w:rFonts w:ascii="Times New Roman" w:eastAsiaTheme="minorEastAsia" w:hAnsi="Times New Roman" w:cs="Times New Roman"/>
+                <w:sz w:val="24"/>
+                <w:szCs w:val="24"/>
+                <w:lang w:val="en-AU"/>
+              </w:rPr>
+            </w:pPr>
+          </w:p>
+        </w:tc>
+        <w:tc>
+          <w:tcPr>
+            <w:tcW w:w="1843" w:type="dxa"/>
+          </w:tcPr>
+          <w:p>
+            <w:pPr>
+              <w:pStyle w:val="ListParagraph"/>
+              <w:spacing w:before="120" w:after="120" w:line="240" w:lineRule="auto"/>
+              <w:ind w:left="0"/>
+              <w:contextualSpacing w:val="0"/>
+              <w:jc w:val="both"/>
+              <w:rPr>
+                <w:rFonts w:ascii="Times New Roman" w:eastAsiaTheme="minorEastAsia" w:hAnsi="Times New Roman" w:cs="Times New Roman"/>
+                <w:sz w:val="24"/>
+                <w:szCs w:val="24"/>
+                <w:lang w:val="en-AU"/>
+              </w:rPr>
+            </w:pPr>
+            <w:r>
+              <w:rPr>
+                <w:rFonts w:ascii="Times New Roman" w:eastAsiaTheme="minorEastAsia" w:hAnsi="Times New Roman" w:cs="Times New Roman"/>
+                <w:sz w:val="24"/>
+                <w:szCs w:val="24"/>
+                <w:lang w:val="en-AU"/>
+              </w:rPr>
+              <w:t>Analytics / Forecasting model</w:t>
+            </w:r>
+          </w:p>
+        </w:tc>
+        <w:tc>
+          <w:tcPr>
+            <w:tcW w:w="3918" w:type="dxa"/>
+          </w:tcPr>
+          <w:p>
+            <w:pPr>
+              <w:pStyle w:val="ListParagraph"/>
+              <w:spacing w:before="120" w:after="120" w:line="240" w:lineRule="auto"/>
+              <w:ind w:left="0"/>
+              <w:contextualSpacing w:val="0"/>
+              <w:jc w:val="both"/>
+              <w:rPr>
+                <w:rFonts w:ascii="Times New Roman" w:eastAsiaTheme="minorEastAsia" w:hAnsi="Times New Roman" w:cs="Times New Roman"/>
+                <w:sz w:val="24"/>
+                <w:szCs w:val="24"/>
+                <w:lang w:val="en-AU"/>
+              </w:rPr>
+            </w:pPr>
+            <w:r>
+              <w:rPr>
+                <w:rFonts w:ascii="Times New Roman" w:eastAsiaTheme="minorEastAsia" w:hAnsi="Times New Roman" w:cs="Times New Roman"/>
+                <w:sz w:val="24"/>
+                <w:szCs w:val="24"/>
+                <w:lang w:val="en-AU"/>
+              </w:rPr>
+              <w:t>Performs feature engineering and develops, tunes and validates the forecasting model.</w:t>
+            </w:r>
+          </w:p>
+        </w:tc>
+      </w:tr>
+    </w:tbl>
+    <w:p>
+      <w:pPr>
+        <w:pStyle w:val="ListParagraph"/>
+        <w:spacing w:before="120" w:after="120" w:line="240" w:lineRule="auto"/>
+        <w:ind w:left="426"/>
+        <w:contextualSpacing w:val="0"/>
+        <w:jc w:val="both"/>
+        <w:rPr>
+          <w:rFonts w:ascii="Times New Roman" w:eastAsiaTheme="minorEastAsia" w:hAnsi="Times New Roman" w:cs="Times New Roman"/>
+          <w:sz w:val="24"/>
+          <w:szCs w:val="24"/>
+          <w:lang w:val="en-AU"/>
+        </w:rPr>
+      </w:pPr>
     </w:p>
     <w:p>
       <w:pPr>
@@ -1472,15 +4013,10 @@
     <w:p>
       <w:pPr>
         <w:pStyle w:val="ListParagraph"/>
-        <w:numPr>
-          <w:ilvl w:val="0"/>
-          <w:numId w:val="7"/>
-        </w:numPr>
         <w:spacing w:before="120" w:after="120" w:line="240" w:lineRule="auto"/>
         <w:ind w:left="426"/>
         <w:contextualSpacing w:val="0"/>
         <w:jc w:val="both"/>
-        <w:outlineLvl w:val="0"/>
         <w:rPr>
           <w:rFonts w:ascii="Times New Roman" w:eastAsiaTheme="minorEastAsia" w:hAnsi="Times New Roman" w:cs="Times New Roman"/>
           <w:b/>
@@ -1489,17 +4025,6 @@
           <w:szCs w:val="24"/>
         </w:rPr>
       </w:pPr>
-      <w:r>
-        <w:rPr>
-          <w:rFonts w:ascii="Times New Roman" w:eastAsiaTheme="minorEastAsia" w:hAnsi="Times New Roman" w:cs="Times New Roman"/>
-          <w:b/>
-          <w:bCs/>
-          <w:sz w:val="24"/>
-          <w:szCs w:val="24"/>
-          <w:lang w:val="vi-VN"/>
-        </w:rPr>
-        <w:t>Ethics, privacy and security considerations</w:t>
-      </w:r>
     </w:p>
     <w:p>
       <w:pPr>
@@ -1530,6 +4055,142 @@
           <w:szCs w:val="24"/>
           <w:lang w:val="vi-VN"/>
         </w:rPr>
+        <w:t>Ethics, privacy and security considerations</w:t>
+      </w:r>
+    </w:p>
+    <w:p>
+      <w:pPr>
+        <w:rPr>
+          <w:rFonts w:ascii="Times New Roman" w:eastAsiaTheme="minorEastAsia" w:hAnsi="Times New Roman"/>
+          <w:b/>
+          <w:bCs/>
+          <w:sz w:val="24"/>
+        </w:rPr>
+      </w:pPr>
+    </w:p>
+    <w:p>
+      <w:pPr>
+        <w:rPr>
+          <w:rFonts w:ascii="Times New Roman" w:eastAsiaTheme="minorEastAsia" w:hAnsi="Times New Roman"/>
+          <w:b/>
+          <w:bCs/>
+          <w:sz w:val="24"/>
+        </w:rPr>
+      </w:pPr>
+    </w:p>
+    <w:p>
+      <w:pPr>
+        <w:rPr>
+          <w:rFonts w:ascii="Times New Roman" w:eastAsiaTheme="minorEastAsia" w:hAnsi="Times New Roman"/>
+          <w:b/>
+          <w:bCs/>
+          <w:sz w:val="24"/>
+        </w:rPr>
+      </w:pPr>
+    </w:p>
+    <w:p>
+      <w:pPr>
+        <w:rPr>
+          <w:rFonts w:ascii="Times New Roman" w:eastAsiaTheme="minorEastAsia" w:hAnsi="Times New Roman"/>
+          <w:b/>
+          <w:bCs/>
+          <w:sz w:val="24"/>
+        </w:rPr>
+      </w:pPr>
+    </w:p>
+    <w:p>
+      <w:pPr>
+        <w:rPr>
+          <w:rFonts w:ascii="Times New Roman" w:eastAsiaTheme="minorEastAsia" w:hAnsi="Times New Roman"/>
+          <w:b/>
+          <w:bCs/>
+          <w:sz w:val="24"/>
+        </w:rPr>
+      </w:pPr>
+      <w:r>
+        <w:rPr>
+          <w:rFonts w:ascii="Times New Roman" w:eastAsiaTheme="minorEastAsia" w:hAnsi="Times New Roman"/>
+          <w:b/>
+          <w:bCs/>
+          <w:sz w:val="24"/>
+        </w:rPr>
+        <w:t xml:space="preserve">GitHub repository: </w:t>
+      </w:r>
+      <w:hyperlink r:id="rId12" w:history="1">
+        <w:r>
+          <w:rPr>
+            <w:rStyle w:val="Hyperlink"/>
+            <w:rFonts w:ascii="Times New Roman" w:eastAsiaTheme="minorEastAsia" w:hAnsi="Times New Roman"/>
+            <w:sz w:val="24"/>
+          </w:rPr>
+          <w:t>https://github.com/HendrickDang/PRT661-DATA-SCIENCE-PRACTICE</w:t>
+        </w:r>
+      </w:hyperlink>
+    </w:p>
+    <w:p>
+      <w:pPr>
+        <w:rPr>
+          <w:rFonts w:ascii="Times New Roman" w:eastAsiaTheme="minorEastAsia" w:hAnsi="Times New Roman"/>
+          <w:sz w:val="24"/>
+        </w:rPr>
+      </w:pPr>
+      <w:r>
+        <w:rPr>
+          <w:rFonts w:ascii="Times New Roman" w:eastAsiaTheme="minorEastAsia" w:hAnsi="Times New Roman"/>
+          <w:b/>
+          <w:bCs/>
+          <w:sz w:val="24"/>
+        </w:rPr>
+        <w:t>Project management board</w:t>
+      </w:r>
+      <w:r>
+        <w:rPr>
+          <w:rFonts w:ascii="Times New Roman" w:eastAsiaTheme="minorEastAsia" w:hAnsi="Times New Roman"/>
+          <w:b/>
+          <w:bCs/>
+          <w:sz w:val="24"/>
+        </w:rPr>
+        <w:t xml:space="preserve"> (JIRA)</w:t>
+      </w:r>
+      <w:r>
+        <w:rPr>
+          <w:rFonts w:ascii="Times New Roman" w:eastAsiaTheme="minorEastAsia" w:hAnsi="Times New Roman"/>
+          <w:b/>
+          <w:bCs/>
+          <w:sz w:val="24"/>
+        </w:rPr>
+        <w:t xml:space="preserve">: </w:t>
+      </w:r>
+    </w:p>
+    <w:p>
+      <w:pPr>
+        <w:pStyle w:val="ListParagraph"/>
+        <w:numPr>
+          <w:ilvl w:val="0"/>
+          <w:numId w:val="7"/>
+        </w:numPr>
+        <w:spacing w:before="120" w:after="120" w:line="240" w:lineRule="auto"/>
+        <w:ind w:left="426"/>
+        <w:contextualSpacing w:val="0"/>
+        <w:jc w:val="both"/>
+        <w:outlineLvl w:val="0"/>
+        <w:rPr>
+          <w:rFonts w:ascii="Times New Roman" w:eastAsiaTheme="minorEastAsia" w:hAnsi="Times New Roman" w:cs="Times New Roman"/>
+          <w:b/>
+          <w:bCs/>
+          <w:sz w:val="24"/>
+          <w:szCs w:val="24"/>
+        </w:rPr>
+      </w:pPr>
+      <w:r>
+        <w:rPr>
+          <w:rFonts w:ascii="Times New Roman" w:eastAsiaTheme="minorEastAsia" w:hAnsi="Times New Roman" w:cs="Times New Roman"/>
+          <w:b/>
+          <w:bCs/>
+          <w:sz w:val="24"/>
+          <w:szCs w:val="24"/>
+          <w:lang w:val="vi-VN"/>
+        </w:rPr>
         <w:t>References</w:t>
       </w:r>
     </w:p>
@@ -1546,8 +4207,8 @@
       </w:pPr>
     </w:p>
     <w:sectPr>
-      <w:headerReference w:type="default" r:id="rId12"/>
-      <w:footerReference w:type="default" r:id="rId13"/>
+      <w:headerReference w:type="default" r:id="rId13"/>
+      <w:footerReference w:type="default" r:id="rId14"/>
       <w:pgSz w:w="11906" w:h="16838" w:code="9"/>
       <w:pgMar w:top="1440" w:right="1440" w:bottom="1440" w:left="1440" w:header="709" w:footer="709" w:gutter="0"/>
       <w:pgNumType w:start="0"/>
@@ -1757,7 +4418,7 @@
             </wp:anchor>
           </w:drawing>
         </mc:Choice>
-        <mc:Fallback xmlns:a="http://schemas.openxmlformats.org/drawingml/2006/main" xmlns:a14="http://schemas.microsoft.com/office/drawing/2010/main" xmlns:arto="http://schemas.microsoft.com/office/word/2006/arto">
+        <mc:Fallback xmlns:arto="http://schemas.microsoft.com/office/word/2006/arto" xmlns:a14="http://schemas.microsoft.com/office/drawing/2010/main" xmlns:a="http://schemas.openxmlformats.org/drawingml/2006/main">
           <w:pict w14:anchorId="438EB0FD">
             <v:line id="Line 1" style="position:absolute;z-index:251657728;visibility:visible;mso-wrap-style:square;mso-width-percent:0;mso-height-percent:0;mso-wrap-distance-left:9pt;mso-wrap-distance-top:0;mso-wrap-distance-right:9pt;mso-wrap-distance-bottom:0;mso-position-horizontal:absolute;mso-position-horizontal-relative:text;mso-position-vertical:absolute;mso-position-vertical-relative:text;mso-width-percent:0;mso-height-percent:0;mso-width-relative:page;mso-height-relative:page" o:spid="_x0000_s1026" from="-33.75pt,8.05pt" to="453pt,8.05pt" w14:anchorId="26AEED93" o:gfxdata="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"/>
           </w:pict>
@@ -5396,6 +8057,7 @@
   <w:style w:type="character" w:default="1" w:styleId="DefaultParagraphFont">
     <w:name w:val="Default Paragraph Font"/>
     <w:uiPriority w:val="1"/>
+    <w:semiHidden/>
     <w:unhideWhenUsed/>
   </w:style>
   <w:style w:type="table" w:default="1" w:styleId="TableNormal">
@@ -5775,6 +8437,24 @@
       <w:spacing w:after="100"/>
       <w:ind w:left="400"/>
     </w:pPr>
+  </w:style>
+  <w:style w:type="paragraph" w:styleId="Caption">
+    <w:name w:val="caption"/>
+    <w:basedOn w:val="Normal"/>
+    <w:next w:val="Normal"/>
+    <w:unhideWhenUsed/>
+    <w:qFormat/>
+    <w:rsid w:val="00AB2A3E"/>
+    <w:pPr>
+      <w:spacing w:after="200"/>
+    </w:pPr>
+    <w:rPr>
+      <w:i/>
+      <w:iCs/>
+      <w:color w:val="1F497D" w:themeColor="text2"/>
+      <w:sz w:val="18"/>
+      <w:szCs w:val="18"/>
+    </w:rPr>
   </w:style>
 </w:styles>
 </file>
@@ -6065,16 +8745,25 @@
 </file>
 
 <file path=customXml/item1.xml><?xml version="1.0" encoding="utf-8"?>
+<b:Sources xmlns:b="http://schemas.openxmlformats.org/officeDocument/2006/bibliography" xmlns="http://schemas.openxmlformats.org/officeDocument/2006/bibliography" SelectedStyle="\APASixthEditionOfficeOnline.xsl" StyleName="APA" Version="6"/>
+</file>
+
+<file path=customXml/item2.xml><?xml version="1.0" encoding="utf-8"?>
 <p:properties xmlns:p="http://schemas.microsoft.com/office/2006/metadata/properties" xmlns:xsi="http://www.w3.org/2001/XMLSchema-instance" xmlns:pc="http://schemas.microsoft.com/office/infopath/2007/PartnerControls">
   <documentManagement/>
 </p:properties>
 </file>
 
-<file path=customXml/item2.xml><?xml version="1.0" encoding="utf-8"?>
-<b:Sources xmlns:b="http://schemas.openxmlformats.org/officeDocument/2006/bibliography" xmlns="http://schemas.openxmlformats.org/officeDocument/2006/bibliography" SelectedStyle="\APASixthEditionOfficeOnline.xsl" StyleName="APA" Version="6"/>
+<file path=customXml/item3.xml><?xml version="1.0" encoding="utf-8"?>
+<?mso-contentType ?>
+<FormTemplates xmlns="http://schemas.microsoft.com/sharepoint/v3/contenttype/forms">
+  <Display>DocumentLibraryForm</Display>
+  <Edit>DocumentLibraryForm</Edit>
+  <New>DocumentLibraryForm</New>
+</FormTemplates>
 </file>
 
-<file path=customXml/item3.xml><?xml version="1.0" encoding="utf-8"?>
+<file path=customXml/item4.xml><?xml version="1.0" encoding="utf-8"?>
 <ct:contentTypeSchema xmlns:ct="http://schemas.microsoft.com/office/2006/metadata/contentType" xmlns:ma="http://schemas.microsoft.com/office/2006/metadata/properties/metaAttributes" ct:_="" ma:_="" ma:contentTypeName="Document" ma:contentTypeID="0x010100AC10F159CED5F8449669B517D586ED14" ma:contentTypeVersion="10" ma:contentTypeDescription="Create a new document." ma:contentTypeScope="" ma:versionID="03c98b9a3c92f0aa3758f1e849820bc2">
   <xsd:schema xmlns:xsd="http://www.w3.org/2001/XMLSchema" xmlns:xs="http://www.w3.org/2001/XMLSchema" xmlns:p="http://schemas.microsoft.com/office/2006/metadata/properties" xmlns:ns3="26261283-ed6e-4415-8a03-15fb5e273054" targetNamespace="http://schemas.microsoft.com/office/2006/metadata/properties" ma:root="true" ma:fieldsID="60cd43c6fb86be7eace491730ae7f469" ns3:_="">
     <xsd:import namespace="26261283-ed6e-4415-8a03-15fb5e273054"/>
@@ -6258,16 +8947,15 @@
 </ct:contentTypeSchema>
 </file>
 
-<file path=customXml/item4.xml><?xml version="1.0" encoding="utf-8"?>
-<?mso-contentType ?>
-<FormTemplates xmlns="http://schemas.microsoft.com/sharepoint/v3/contenttype/forms">
-  <Display>DocumentLibraryForm</Display>
-  <Edit>DocumentLibraryForm</Edit>
-  <New>DocumentLibraryForm</New>
-</FormTemplates>
+<file path=customXml/itemProps1.xml><?xml version="1.0" encoding="utf-8"?>
+<ds:datastoreItem xmlns:ds="http://schemas.openxmlformats.org/officeDocument/2006/customXml" ds:itemID="{E3DA75CE-018A-4AF1-8B5C-BF0FBFE76924}">
+  <ds:schemaRefs>
+    <ds:schemaRef ds:uri="http://schemas.openxmlformats.org/officeDocument/2006/bibliography"/>
+  </ds:schemaRefs>
+</ds:datastoreItem>
 </file>
 
-<file path=customXml/itemProps1.xml><?xml version="1.0" encoding="utf-8"?>
+<file path=customXml/itemProps2.xml><?xml version="1.0" encoding="utf-8"?>
 <ds:datastoreItem xmlns:ds="http://schemas.openxmlformats.org/officeDocument/2006/customXml" ds:itemID="{B2E31085-3E06-4A9F-9730-20A04C85DF24}">
   <ds:schemaRefs>
     <ds:schemaRef ds:uri="http://schemas.microsoft.com/office/2006/metadata/properties"/>
@@ -6276,15 +8964,15 @@
 </ds:datastoreItem>
 </file>
 
-<file path=customXml/itemProps2.xml><?xml version="1.0" encoding="utf-8"?>
-<ds:datastoreItem xmlns:ds="http://schemas.openxmlformats.org/officeDocument/2006/customXml" ds:itemID="{E3DA75CE-018A-4AF1-8B5C-BF0FBFE76924}">
+<file path=customXml/itemProps3.xml><?xml version="1.0" encoding="utf-8"?>
+<ds:datastoreItem xmlns:ds="http://schemas.openxmlformats.org/officeDocument/2006/customXml" ds:itemID="{82A9BB68-56B4-4822-B6B7-DB471576EB1F}">
   <ds:schemaRefs>
-    <ds:schemaRef ds:uri="http://schemas.openxmlformats.org/officeDocument/2006/bibliography"/>
+    <ds:schemaRef ds:uri="http://schemas.microsoft.com/sharepoint/v3/contenttype/forms"/>
   </ds:schemaRefs>
 </ds:datastoreItem>
 </file>
 
-<file path=customXml/itemProps3.xml><?xml version="1.0" encoding="utf-8"?>
+<file path=customXml/itemProps4.xml><?xml version="1.0" encoding="utf-8"?>
 <ds:datastoreItem xmlns:ds="http://schemas.openxmlformats.org/officeDocument/2006/customXml" ds:itemID="{74E295E1-A503-4C08-A7E7-77E19C3BAFAF}">
   <ds:schemaRefs>
     <ds:schemaRef ds:uri="http://schemas.microsoft.com/office/2006/metadata/contentType"/>
@@ -6300,12 +8988,4 @@
     <ds:schemaRef ds:uri="http://schemas.microsoft.com/internal/obd"/>
   </ds:schemaRefs>
 </ds:datastoreItem>
-</file>
-
-<file path=customXml/itemProps4.xml><?xml version="1.0" encoding="utf-8"?>
-<ds:datastoreItem xmlns:ds="http://schemas.openxmlformats.org/officeDocument/2006/customXml" ds:itemID="{82A9BB68-56B4-4822-B6B7-DB471576EB1F}">
-  <ds:schemaRefs>
-    <ds:schemaRef ds:uri="http://schemas.microsoft.com/sharepoint/v3/contenttype/forms"/>
-  </ds:schemaRefs>
-</ds:datastoreItem>
 </file>
</xml_diff>